<commit_message>
Compare player history strategies
</commit_message>
<xml_diff>
--- a/docs/Adaptive_Chess_Engine_Project_Report.docx
+++ b/docs/Adaptive_Chess_Engine_Project_Report.docx
@@ -7351,6 +7351,671 @@
     </w:p>
     <w:p>
       <w:pPr>
+        <w:pStyle w:val="Heading3"/>
+      </w:pPr>
+      <w:r>
+        <w:t>10.1 Lifetime, recent, decayed, and online comparison</w:t>
+      </w:r>
+    </w:p>
+    <w:p>
+      <w:r>
+        <w:t>A follow-up experiment compared five history strategies with the same boosting model. Window sizes and decay rates were selected on validation only. Recent training used the latest 200 games, time decay used a 400-game half-life, and the online arm predicted 20-game batches before adding each completed batch to its history.</w:t>
+      </w:r>
+    </w:p>
+    <w:tbl>
+      <w:tblPr>
+        <w:tblStyle w:val="TableGrid"/>
+        <w:tblW w:type="auto" w:w="0"/>
+        <w:jc w:val="center"/>
+        <w:tblLayout w:type="fixed"/>
+        <w:tblLook w:firstColumn="1" w:firstRow="1" w:lastColumn="0" w:lastRow="0" w:noHBand="0" w:noVBand="1" w:val="04A0"/>
+      </w:tblPr>
+      <w:tblGrid>
+        <w:gridCol w:w="2469"/>
+        <w:gridCol w:w="2469"/>
+        <w:gridCol w:w="2469"/>
+        <w:gridCol w:w="2469"/>
+      </w:tblGrid>
+      <w:tr>
+        <w:trPr>
+          <w:tblHeader w:val="true"/>
+          <w:cantSplit/>
+        </w:trPr>
+        <w:tc>
+          <w:tcPr>
+            <w:tcW w:type="dxa" w:w="2880"/>
+            <w:shd w:fill="17365D"/>
+            <w:vAlign w:val="center"/>
+            <w:tcMar>
+              <w:top w:w="100" w:type="dxa"/>
+              <w:start w:w="120" w:type="dxa"/>
+              <w:bottom w:w="100" w:type="dxa"/>
+              <w:end w:w="120" w:type="dxa"/>
+            </w:tcMar>
+          </w:tcPr>
+          <w:p>
+            <w:pPr>
+              <w:keepNext/>
+              <w:jc w:val="center"/>
+            </w:pPr>
+            <w:r>
+              <w:rPr>
+                <w:b/>
+                <w:color w:val="FFFFFF"/>
+                <w:sz w:val="16"/>
+              </w:rPr>
+              <w:t>History strategy</w:t>
+            </w:r>
+          </w:p>
+        </w:tc>
+        <w:tc>
+          <w:tcPr>
+            <w:tcW w:type="dxa" w:w="1440"/>
+            <w:shd w:fill="17365D"/>
+            <w:vAlign w:val="center"/>
+            <w:tcMar>
+              <w:top w:w="100" w:type="dxa"/>
+              <w:start w:w="120" w:type="dxa"/>
+              <w:bottom w:w="100" w:type="dxa"/>
+              <w:end w:w="120" w:type="dxa"/>
+            </w:tcMar>
+          </w:tcPr>
+          <w:p>
+            <w:pPr>
+              <w:keepNext/>
+              <w:jc w:val="center"/>
+            </w:pPr>
+            <w:r>
+              <w:rPr>
+                <w:b/>
+                <w:color w:val="FFFFFF"/>
+                <w:sz w:val="16"/>
+              </w:rPr>
+              <w:t>Log loss</w:t>
+            </w:r>
+          </w:p>
+        </w:tc>
+        <w:tc>
+          <w:tcPr>
+            <w:tcW w:type="dxa" w:w="1440"/>
+            <w:shd w:fill="17365D"/>
+            <w:vAlign w:val="center"/>
+            <w:tcMar>
+              <w:top w:w="100" w:type="dxa"/>
+              <w:start w:w="120" w:type="dxa"/>
+              <w:bottom w:w="100" w:type="dxa"/>
+              <w:end w:w="120" w:type="dxa"/>
+            </w:tcMar>
+          </w:tcPr>
+          <w:p>
+            <w:pPr>
+              <w:keepNext/>
+              <w:jc w:val="center"/>
+            </w:pPr>
+            <w:r>
+              <w:rPr>
+                <w:b/>
+                <w:color w:val="FFFFFF"/>
+                <w:sz w:val="16"/>
+              </w:rPr>
+              <w:t>ROC AUC</w:t>
+            </w:r>
+          </w:p>
+        </w:tc>
+        <w:tc>
+          <w:tcPr>
+            <w:tcW w:type="dxa" w:w="4320"/>
+            <w:shd w:fill="17365D"/>
+            <w:vAlign w:val="center"/>
+            <w:tcMar>
+              <w:top w:w="100" w:type="dxa"/>
+              <w:start w:w="120" w:type="dxa"/>
+              <w:bottom w:w="100" w:type="dxa"/>
+              <w:end w:w="120" w:type="dxa"/>
+            </w:tcMar>
+          </w:tcPr>
+          <w:p>
+            <w:pPr>
+              <w:keepNext/>
+              <w:jc w:val="center"/>
+            </w:pPr>
+            <w:r>
+              <w:rPr>
+                <w:b/>
+                <w:color w:val="FFFFFF"/>
+                <w:sz w:val="16"/>
+              </w:rPr>
+              <w:t>Meaning</w:t>
+            </w:r>
+          </w:p>
+        </w:tc>
+      </w:tr>
+      <w:tr>
+        <w:trPr>
+          <w:cantSplit/>
+        </w:trPr>
+        <w:tc>
+          <w:tcPr>
+            <w:tcW w:type="dxa" w:w="2880"/>
+            <w:vAlign w:val="center"/>
+            <w:tcMar>
+              <w:top w:w="100" w:type="dxa"/>
+              <w:start w:w="120" w:type="dxa"/>
+              <w:bottom w:w="100" w:type="dxa"/>
+              <w:end w:w="120" w:type="dxa"/>
+            </w:tcMar>
+          </w:tcPr>
+          <w:p>
+            <w:pPr>
+              <w:spacing w:after="0"/>
+              <w:jc w:val="left"/>
+            </w:pPr>
+            <w:r>
+              <w:rPr>
+                <w:sz w:val="16"/>
+              </w:rPr>
+              <w:t>Population</w:t>
+            </w:r>
+          </w:p>
+        </w:tc>
+        <w:tc>
+          <w:tcPr>
+            <w:tcW w:type="dxa" w:w="1440"/>
+            <w:vAlign w:val="center"/>
+            <w:tcMar>
+              <w:top w:w="100" w:type="dxa"/>
+              <w:start w:w="120" w:type="dxa"/>
+              <w:bottom w:w="100" w:type="dxa"/>
+              <w:end w:w="120" w:type="dxa"/>
+            </w:tcMar>
+          </w:tcPr>
+          <w:p>
+            <w:pPr>
+              <w:spacing w:after="0"/>
+              <w:jc w:val="center"/>
+            </w:pPr>
+            <w:r>
+              <w:rPr>
+                <w:sz w:val="16"/>
+              </w:rPr>
+              <w:t>0.40004</w:t>
+            </w:r>
+          </w:p>
+        </w:tc>
+        <w:tc>
+          <w:tcPr>
+            <w:tcW w:type="dxa" w:w="1440"/>
+            <w:vAlign w:val="center"/>
+            <w:tcMar>
+              <w:top w:w="100" w:type="dxa"/>
+              <w:start w:w="120" w:type="dxa"/>
+              <w:bottom w:w="100" w:type="dxa"/>
+              <w:end w:w="120" w:type="dxa"/>
+            </w:tcMar>
+          </w:tcPr>
+          <w:p>
+            <w:pPr>
+              <w:spacing w:after="0"/>
+              <w:jc w:val="center"/>
+            </w:pPr>
+            <w:r>
+              <w:rPr>
+                <w:sz w:val="16"/>
+              </w:rPr>
+              <w:t>0.62223</w:t>
+            </w:r>
+          </w:p>
+        </w:tc>
+        <w:tc>
+          <w:tcPr>
+            <w:tcW w:type="dxa" w:w="4320"/>
+            <w:vAlign w:val="center"/>
+            <w:tcMar>
+              <w:top w:w="100" w:type="dxa"/>
+              <w:start w:w="120" w:type="dxa"/>
+              <w:bottom w:w="100" w:type="dxa"/>
+              <w:end w:w="120" w:type="dxa"/>
+            </w:tcMar>
+          </w:tcPr>
+          <w:p>
+            <w:pPr>
+              <w:spacing w:after="0"/>
+              <w:jc w:val="center"/>
+            </w:pPr>
+            <w:r>
+              <w:rPr>
+                <w:sz w:val="16"/>
+              </w:rPr>
+              <w:t>General human-position baseline</w:t>
+            </w:r>
+          </w:p>
+        </w:tc>
+      </w:tr>
+      <w:tr>
+        <w:trPr>
+          <w:cantSplit/>
+        </w:trPr>
+        <w:tc>
+          <w:tcPr>
+            <w:tcW w:type="dxa" w:w="2880"/>
+            <w:vAlign w:val="center"/>
+            <w:tcMar>
+              <w:top w:w="100" w:type="dxa"/>
+              <w:start w:w="120" w:type="dxa"/>
+              <w:bottom w:w="100" w:type="dxa"/>
+              <w:end w:w="120" w:type="dxa"/>
+            </w:tcMar>
+            <w:shd w:fill="F3F7FB"/>
+          </w:tcPr>
+          <w:p>
+            <w:pPr>
+              <w:spacing w:after="0"/>
+              <w:jc w:val="left"/>
+            </w:pPr>
+            <w:r>
+              <w:rPr>
+                <w:sz w:val="16"/>
+              </w:rPr>
+              <w:t>Lifetime personal</w:t>
+            </w:r>
+          </w:p>
+        </w:tc>
+        <w:tc>
+          <w:tcPr>
+            <w:tcW w:type="dxa" w:w="1440"/>
+            <w:vAlign w:val="center"/>
+            <w:tcMar>
+              <w:top w:w="100" w:type="dxa"/>
+              <w:start w:w="120" w:type="dxa"/>
+              <w:bottom w:w="100" w:type="dxa"/>
+              <w:end w:w="120" w:type="dxa"/>
+            </w:tcMar>
+            <w:shd w:fill="F3F7FB"/>
+          </w:tcPr>
+          <w:p>
+            <w:pPr>
+              <w:spacing w:after="0"/>
+              <w:jc w:val="center"/>
+            </w:pPr>
+            <w:r>
+              <w:rPr>
+                <w:sz w:val="16"/>
+              </w:rPr>
+              <w:t>0.39348</w:t>
+            </w:r>
+          </w:p>
+        </w:tc>
+        <w:tc>
+          <w:tcPr>
+            <w:tcW w:type="dxa" w:w="1440"/>
+            <w:vAlign w:val="center"/>
+            <w:tcMar>
+              <w:top w:w="100" w:type="dxa"/>
+              <w:start w:w="120" w:type="dxa"/>
+              <w:bottom w:w="100" w:type="dxa"/>
+              <w:end w:w="120" w:type="dxa"/>
+            </w:tcMar>
+            <w:shd w:fill="F3F7FB"/>
+          </w:tcPr>
+          <w:p>
+            <w:pPr>
+              <w:spacing w:after="0"/>
+              <w:jc w:val="center"/>
+            </w:pPr>
+            <w:r>
+              <w:rPr>
+                <w:sz w:val="16"/>
+              </w:rPr>
+              <w:t>0.64934</w:t>
+            </w:r>
+          </w:p>
+        </w:tc>
+        <w:tc>
+          <w:tcPr>
+            <w:tcW w:type="dxa" w:w="4320"/>
+            <w:vAlign w:val="center"/>
+            <w:tcMar>
+              <w:top w:w="100" w:type="dxa"/>
+              <w:start w:w="120" w:type="dxa"/>
+              <w:bottom w:w="100" w:type="dxa"/>
+              <w:end w:w="120" w:type="dxa"/>
+            </w:tcMar>
+            <w:shd w:fill="F3F7FB"/>
+          </w:tcPr>
+          <w:p>
+            <w:pPr>
+              <w:spacing w:after="0"/>
+              <w:jc w:val="center"/>
+            </w:pPr>
+            <w:r>
+              <w:rPr>
+                <w:sz w:val="16"/>
+              </w:rPr>
+              <w:t>Best validation-selected frozen model</w:t>
+            </w:r>
+          </w:p>
+        </w:tc>
+      </w:tr>
+      <w:tr>
+        <w:trPr>
+          <w:cantSplit/>
+        </w:trPr>
+        <w:tc>
+          <w:tcPr>
+            <w:tcW w:type="dxa" w:w="2880"/>
+            <w:vAlign w:val="center"/>
+            <w:tcMar>
+              <w:top w:w="100" w:type="dxa"/>
+              <w:start w:w="120" w:type="dxa"/>
+              <w:bottom w:w="100" w:type="dxa"/>
+              <w:end w:w="120" w:type="dxa"/>
+            </w:tcMar>
+          </w:tcPr>
+          <w:p>
+            <w:pPr>
+              <w:spacing w:after="0"/>
+              <w:jc w:val="left"/>
+            </w:pPr>
+            <w:r>
+              <w:rPr>
+                <w:sz w:val="16"/>
+              </w:rPr>
+              <w:t>Recent 200 games</w:t>
+            </w:r>
+          </w:p>
+        </w:tc>
+        <w:tc>
+          <w:tcPr>
+            <w:tcW w:type="dxa" w:w="1440"/>
+            <w:vAlign w:val="center"/>
+            <w:tcMar>
+              <w:top w:w="100" w:type="dxa"/>
+              <w:start w:w="120" w:type="dxa"/>
+              <w:bottom w:w="100" w:type="dxa"/>
+              <w:end w:w="120" w:type="dxa"/>
+            </w:tcMar>
+          </w:tcPr>
+          <w:p>
+            <w:pPr>
+              <w:spacing w:after="0"/>
+              <w:jc w:val="center"/>
+            </w:pPr>
+            <w:r>
+              <w:rPr>
+                <w:sz w:val="16"/>
+              </w:rPr>
+              <w:t>0.40185</w:t>
+            </w:r>
+          </w:p>
+        </w:tc>
+        <w:tc>
+          <w:tcPr>
+            <w:tcW w:type="dxa" w:w="1440"/>
+            <w:vAlign w:val="center"/>
+            <w:tcMar>
+              <w:top w:w="100" w:type="dxa"/>
+              <w:start w:w="120" w:type="dxa"/>
+              <w:bottom w:w="100" w:type="dxa"/>
+              <w:end w:w="120" w:type="dxa"/>
+            </w:tcMar>
+          </w:tcPr>
+          <w:p>
+            <w:pPr>
+              <w:spacing w:after="0"/>
+              <w:jc w:val="center"/>
+            </w:pPr>
+            <w:r>
+              <w:rPr>
+                <w:sz w:val="16"/>
+              </w:rPr>
+              <w:t>0.64797</w:t>
+            </w:r>
+          </w:p>
+        </w:tc>
+        <w:tc>
+          <w:tcPr>
+            <w:tcW w:type="dxa" w:w="4320"/>
+            <w:vAlign w:val="center"/>
+            <w:tcMar>
+              <w:top w:w="100" w:type="dxa"/>
+              <w:start w:w="120" w:type="dxa"/>
+              <w:bottom w:w="100" w:type="dxa"/>
+              <w:end w:w="120" w:type="dxa"/>
+            </w:tcMar>
+          </w:tcPr>
+          <w:p>
+            <w:pPr>
+              <w:spacing w:after="0"/>
+              <w:jc w:val="center"/>
+            </w:pPr>
+            <w:r>
+              <w:rPr>
+                <w:sz w:val="16"/>
+              </w:rPr>
+              <w:t>Hard cutoff lost calibration and sample strength</w:t>
+            </w:r>
+          </w:p>
+        </w:tc>
+      </w:tr>
+      <w:tr>
+        <w:trPr>
+          <w:cantSplit/>
+        </w:trPr>
+        <w:tc>
+          <w:tcPr>
+            <w:tcW w:type="dxa" w:w="2880"/>
+            <w:vAlign w:val="center"/>
+            <w:tcMar>
+              <w:top w:w="100" w:type="dxa"/>
+              <w:start w:w="120" w:type="dxa"/>
+              <w:bottom w:w="100" w:type="dxa"/>
+              <w:end w:w="120" w:type="dxa"/>
+            </w:tcMar>
+            <w:shd w:fill="F3F7FB"/>
+          </w:tcPr>
+          <w:p>
+            <w:pPr>
+              <w:spacing w:after="0"/>
+              <w:jc w:val="left"/>
+            </w:pPr>
+            <w:r>
+              <w:rPr>
+                <w:sz w:val="16"/>
+              </w:rPr>
+              <w:t>Time-decayed</w:t>
+            </w:r>
+          </w:p>
+        </w:tc>
+        <w:tc>
+          <w:tcPr>
+            <w:tcW w:type="dxa" w:w="1440"/>
+            <w:vAlign w:val="center"/>
+            <w:tcMar>
+              <w:top w:w="100" w:type="dxa"/>
+              <w:start w:w="120" w:type="dxa"/>
+              <w:bottom w:w="100" w:type="dxa"/>
+              <w:end w:w="120" w:type="dxa"/>
+            </w:tcMar>
+            <w:shd w:fill="F3F7FB"/>
+          </w:tcPr>
+          <w:p>
+            <w:pPr>
+              <w:spacing w:after="0"/>
+              <w:jc w:val="center"/>
+            </w:pPr>
+            <w:r>
+              <w:rPr>
+                <w:sz w:val="16"/>
+              </w:rPr>
+              <w:t>0.39768</w:t>
+            </w:r>
+          </w:p>
+        </w:tc>
+        <w:tc>
+          <w:tcPr>
+            <w:tcW w:type="dxa" w:w="1440"/>
+            <w:vAlign w:val="center"/>
+            <w:tcMar>
+              <w:top w:w="100" w:type="dxa"/>
+              <w:start w:w="120" w:type="dxa"/>
+              <w:bottom w:w="100" w:type="dxa"/>
+              <w:end w:w="120" w:type="dxa"/>
+            </w:tcMar>
+            <w:shd w:fill="F3F7FB"/>
+          </w:tcPr>
+          <w:p>
+            <w:pPr>
+              <w:spacing w:after="0"/>
+              <w:jc w:val="center"/>
+            </w:pPr>
+            <w:r>
+              <w:rPr>
+                <w:sz w:val="16"/>
+              </w:rPr>
+              <w:t>0.64526</w:t>
+            </w:r>
+          </w:p>
+        </w:tc>
+        <w:tc>
+          <w:tcPr>
+            <w:tcW w:type="dxa" w:w="4320"/>
+            <w:vAlign w:val="center"/>
+            <w:tcMar>
+              <w:top w:w="100" w:type="dxa"/>
+              <w:start w:w="120" w:type="dxa"/>
+              <w:bottom w:w="100" w:type="dxa"/>
+              <w:end w:w="120" w:type="dxa"/>
+            </w:tcMar>
+            <w:shd w:fill="F3F7FB"/>
+          </w:tcPr>
+          <w:p>
+            <w:pPr>
+              <w:spacing w:after="0"/>
+              <w:jc w:val="center"/>
+            </w:pPr>
+            <w:r>
+              <w:rPr>
+                <w:sz w:val="16"/>
+              </w:rPr>
+              <w:t>Gentler than a cutoff, but below lifetime</w:t>
+            </w:r>
+          </w:p>
+        </w:tc>
+      </w:tr>
+      <w:tr>
+        <w:trPr>
+          <w:cantSplit/>
+        </w:trPr>
+        <w:tc>
+          <w:tcPr>
+            <w:tcW w:type="dxa" w:w="2880"/>
+            <w:vAlign w:val="center"/>
+            <w:tcMar>
+              <w:top w:w="100" w:type="dxa"/>
+              <w:start w:w="120" w:type="dxa"/>
+              <w:bottom w:w="100" w:type="dxa"/>
+              <w:end w:w="120" w:type="dxa"/>
+            </w:tcMar>
+          </w:tcPr>
+          <w:p>
+            <w:pPr>
+              <w:spacing w:after="0"/>
+              <w:jc w:val="left"/>
+            </w:pPr>
+            <w:r>
+              <w:rPr>
+                <w:sz w:val="16"/>
+              </w:rPr>
+              <w:t>Online 20-game updates</w:t>
+            </w:r>
+          </w:p>
+        </w:tc>
+        <w:tc>
+          <w:tcPr>
+            <w:tcW w:type="dxa" w:w="1440"/>
+            <w:vAlign w:val="center"/>
+            <w:tcMar>
+              <w:top w:w="100" w:type="dxa"/>
+              <w:start w:w="120" w:type="dxa"/>
+              <w:bottom w:w="100" w:type="dxa"/>
+              <w:end w:w="120" w:type="dxa"/>
+            </w:tcMar>
+          </w:tcPr>
+          <w:p>
+            <w:pPr>
+              <w:spacing w:after="0"/>
+              <w:jc w:val="center"/>
+            </w:pPr>
+            <w:r>
+              <w:rPr>
+                <w:sz w:val="16"/>
+              </w:rPr>
+              <w:t>0.39048</w:t>
+            </w:r>
+          </w:p>
+        </w:tc>
+        <w:tc>
+          <w:tcPr>
+            <w:tcW w:type="dxa" w:w="1440"/>
+            <w:vAlign w:val="center"/>
+            <w:tcMar>
+              <w:top w:w="100" w:type="dxa"/>
+              <w:start w:w="120" w:type="dxa"/>
+              <w:bottom w:w="100" w:type="dxa"/>
+              <w:end w:w="120" w:type="dxa"/>
+            </w:tcMar>
+          </w:tcPr>
+          <w:p>
+            <w:pPr>
+              <w:spacing w:after="0"/>
+              <w:jc w:val="center"/>
+            </w:pPr>
+            <w:r>
+              <w:rPr>
+                <w:sz w:val="16"/>
+              </w:rPr>
+              <w:t>0.66229</w:t>
+            </w:r>
+          </w:p>
+        </w:tc>
+        <w:tc>
+          <w:tcPr>
+            <w:tcW w:type="dxa" w:w="4320"/>
+            <w:vAlign w:val="center"/>
+            <w:tcMar>
+              <w:top w:w="100" w:type="dxa"/>
+              <w:start w:w="120" w:type="dxa"/>
+              <w:bottom w:w="100" w:type="dxa"/>
+              <w:end w:w="120" w:type="dxa"/>
+            </w:tcMar>
+          </w:tcPr>
+          <w:p>
+            <w:pPr>
+              <w:spacing w:after="0"/>
+              <w:jc w:val="center"/>
+            </w:pPr>
+            <w:r>
+              <w:rPr>
+                <w:sz w:val="16"/>
+              </w:rPr>
+              <w:t>Best forward prediction; retrains after completed batches</w:t>
+            </w:r>
+          </w:p>
+        </w:tc>
+      </w:tr>
+    </w:tbl>
+    <w:p>
+      <w:pPr>
+        <w:spacing w:after="20"/>
+      </w:pPr>
+    </w:p>
+    <w:p>
+      <w:r>
+        <w:t>The data do not support discarding older history for this corpus. Lifetime boosting beat the recent and decayed frozen variants, while online updating was best overall and beat population by -0.00956 log loss with a 95 percent game-bootstrap interval from -0.01343 to -0.00543. The practical interpretation is to retain broad lifetime signal and refresh it as newly labeled games arrive. Because online updating is a process rather than one frozen artifact, lifetime boosting remains the fair fixed model for the causal playing experiment.</w:t>
+      </w:r>
+    </w:p>
+    <w:p>
+      <w:pPr>
         <w:pStyle w:val="Heading2"/>
       </w:pPr>
       <w:r>
@@ -7812,7 +8477,7 @@
         <w:t xml:space="preserve">7. </w:t>
       </w:r>
       <w:r>
-        <w:t>In parallel, compare lifetime, recent-window, time-decayed, and online-updated profiles chronologically to model the player as a changing state rather than a permanent vector.</w:t>
+        <w:t>After the frozen causal match, evaluate a deployment process that periodically relabels completed games and refreshes the lifetime model in preregistered batches.</w:t>
       </w:r>
     </w:p>
     <w:p>
@@ -8472,6 +9137,86 @@
                 <w:sz w:val="16"/>
               </w:rPr>
               <w:t>This Word report and reproducible builder</w:t>
+            </w:r>
+          </w:p>
+        </w:tc>
+      </w:tr>
+      <w:tr>
+        <w:trPr>
+          <w:cantSplit/>
+        </w:trPr>
+        <w:tc>
+          <w:tcPr>
+            <w:tcW w:type="dxa" w:w="1800"/>
+            <w:vAlign w:val="center"/>
+            <w:tcMar>
+              <w:top w:w="100" w:type="dxa"/>
+              <w:start w:w="120" w:type="dxa"/>
+              <w:bottom w:w="100" w:type="dxa"/>
+              <w:end w:w="120" w:type="dxa"/>
+            </w:tcMar>
+            <w:shd w:fill="F3F7FB"/>
+          </w:tcPr>
+          <w:p>
+            <w:pPr>
+              <w:spacing w:after="0"/>
+              <w:jc w:val="left"/>
+            </w:pPr>
+            <w:r>
+              <w:rPr>
+                <w:sz w:val="16"/>
+              </w:rPr>
+              <w:t>30 Sep 2026</w:t>
+            </w:r>
+          </w:p>
+        </w:tc>
+        <w:tc>
+          <w:tcPr>
+            <w:tcW w:type="dxa" w:w="4752"/>
+            <w:vAlign w:val="center"/>
+            <w:tcMar>
+              <w:top w:w="100" w:type="dxa"/>
+              <w:start w:w="120" w:type="dxa"/>
+              <w:bottom w:w="100" w:type="dxa"/>
+              <w:end w:w="120" w:type="dxa"/>
+            </w:tcMar>
+            <w:shd w:fill="F3F7FB"/>
+          </w:tcPr>
+          <w:p>
+            <w:pPr>
+              <w:spacing w:after="0"/>
+              <w:jc w:val="center"/>
+            </w:pPr>
+            <w:r>
+              <w:rPr>
+                <w:sz w:val="16"/>
+              </w:rPr>
+              <w:t>Player-history drift strategies compared</w:t>
+            </w:r>
+          </w:p>
+        </w:tc>
+        <w:tc>
+          <w:tcPr>
+            <w:tcW w:type="dxa" w:w="3528"/>
+            <w:vAlign w:val="center"/>
+            <w:tcMar>
+              <w:top w:w="100" w:type="dxa"/>
+              <w:start w:w="120" w:type="dxa"/>
+              <w:bottom w:w="100" w:type="dxa"/>
+              <w:end w:w="120" w:type="dxa"/>
+            </w:tcMar>
+            <w:shd w:fill="F3F7FB"/>
+          </w:tcPr>
+          <w:p>
+            <w:pPr>
+              <w:spacing w:after="0"/>
+              <w:jc w:val="center"/>
+            </w:pPr>
+            <w:r>
+              <w:rPr>
+                <w:sz w:val="16"/>
+              </w:rPr>
+              <w:t>Lifetime frozen model retained; online updating produced the best forward prediction</w:t>
             </w:r>
           </w:p>
         </w:tc>

</xml_diff>

<commit_message>
Deploy frozen learned adaptive selector
</commit_message>
<xml_diff>
--- a/docs/Adaptive_Chess_Engine_Project_Report.docx
+++ b/docs/Adaptive_Chess_Engine_Project_Report.docx
@@ -88,7 +88,7 @@
         <w:t xml:space="preserve">Repository history reviewed </w:t>
       </w:r>
       <w:r>
-        <w:t>All project commits through f3cd286 on main</w:t>
+        <w:t>All project commits through 2dbeaf0 plus this learned-selector milestone</w:t>
       </w:r>
     </w:p>
     <w:p/>
@@ -307,7 +307,7 @@
         <w:t xml:space="preserve">13. </w:t>
       </w:r>
       <w:r>
-        <w:t>10  Player growth and concept drift</w:t>
+        <w:t>10  Player growth, history, and learned deployment</w:t>
       </w:r>
     </w:p>
     <w:p>
@@ -1942,7 +1942,7 @@
               <w:rPr>
                 <w:sz w:val="17"/>
               </w:rPr>
-              <w:t>MultiPV and bounded adaptive selection</w:t>
+              <w:t>MultiPV, frozen learned inference, and bounded adaptive selection</w:t>
             </w:r>
           </w:p>
         </w:tc>
@@ -1966,7 +1966,7 @@
               <w:rPr>
                 <w:sz w:val="17"/>
               </w:rPr>
-              <w:t>Profile creation and future model export</w:t>
+              <w:t>Profile creation, training, model export, and match analysis</w:t>
             </w:r>
           </w:p>
         </w:tc>
@@ -2608,7 +2608,7 @@
         <w:t xml:space="preserve">Current verification </w:t>
       </w:r>
       <w:r>
-        <w:t>113 Python tests passed in the project research environment on 30 September 2026. The C++ implementation also has dedicated suites for position, perft, move generation, search, pruning, timing, MultiPV, adaptive features, and adaptive selection.</w:t>
+        <w:t>117 Python tests passed in the project research environment on 30 September 2026. The C++ implementation also has dedicated suites for position, perft, move generation, search, pruning, timing, MultiPV, adaptive features, model-inference parity, and adaptive selection.</w:t>
       </w:r>
     </w:p>
     <w:p>
@@ -8016,6 +8016,1121 @@
     </w:p>
     <w:p>
       <w:pPr>
+        <w:pStyle w:val="Heading3"/>
+      </w:pPr>
+      <w:r>
+        <w:t>10.2 Frozen learned selector and safety experiment</w:t>
+      </w:r>
+    </w:p>
+    <w:p>
+      <w:r>
+        <w:t>The lifetime personal and population boosting models were exported as deterministic C++ tree data with source hashes, exact feature order, thresholds, missing-value directions, and leaf values. C++ probabilities match sklearn to within 1e-12 on a parity corpus, and a board fixture matches all 17 Python position features. The fixed exploitation adjustment is 100 centipawns per unit probability difference, capped at plus or minus 20 cp; the existing 35 cp eligibility bound and mate protections remain authoritative.</w:t>
+      </w:r>
+    </w:p>
+    <w:tbl>
+      <w:tblPr>
+        <w:tblStyle w:val="TableGrid"/>
+        <w:tblW w:type="auto" w:w="0"/>
+        <w:jc w:val="center"/>
+        <w:tblLayout w:type="fixed"/>
+        <w:tblLook w:firstColumn="1" w:firstRow="1" w:lastColumn="0" w:lastRow="0" w:noHBand="0" w:noVBand="1" w:val="04A0"/>
+      </w:tblPr>
+      <w:tblGrid>
+        <w:gridCol w:w="2469"/>
+        <w:gridCol w:w="2469"/>
+        <w:gridCol w:w="2469"/>
+        <w:gridCol w:w="2469"/>
+      </w:tblGrid>
+      <w:tr>
+        <w:trPr>
+          <w:tblHeader w:val="true"/>
+          <w:cantSplit/>
+        </w:trPr>
+        <w:tc>
+          <w:tcPr>
+            <w:tcW w:type="dxa" w:w="3024"/>
+            <w:shd w:fill="17365D"/>
+            <w:vAlign w:val="center"/>
+            <w:tcMar>
+              <w:top w:w="100" w:type="dxa"/>
+              <w:start w:w="120" w:type="dxa"/>
+              <w:bottom w:w="100" w:type="dxa"/>
+              <w:end w:w="120" w:type="dxa"/>
+            </w:tcMar>
+          </w:tcPr>
+          <w:p>
+            <w:pPr>
+              <w:keepNext/>
+              <w:jc w:val="center"/>
+            </w:pPr>
+            <w:r>
+              <w:rPr>
+                <w:b/>
+                <w:color w:val="FFFFFF"/>
+                <w:sz w:val="16"/>
+              </w:rPr>
+              <w:t>Policy</w:t>
+            </w:r>
+          </w:p>
+        </w:tc>
+        <w:tc>
+          <w:tcPr>
+            <w:tcW w:type="dxa" w:w="3168"/>
+            <w:shd w:fill="17365D"/>
+            <w:vAlign w:val="center"/>
+            <w:tcMar>
+              <w:top w:w="100" w:type="dxa"/>
+              <w:start w:w="120" w:type="dxa"/>
+              <w:bottom w:w="100" w:type="dxa"/>
+              <w:end w:w="120" w:type="dxa"/>
+            </w:tcMar>
+          </w:tcPr>
+          <w:p>
+            <w:pPr>
+              <w:keepNext/>
+              <w:jc w:val="center"/>
+            </w:pPr>
+            <w:r>
+              <w:rPr>
+                <w:b/>
+                <w:color w:val="FFFFFF"/>
+                <w:sz w:val="16"/>
+              </w:rPr>
+              <w:t>Changes on 32 identical positions</w:t>
+            </w:r>
+          </w:p>
+        </w:tc>
+        <w:tc>
+          <w:tcPr>
+            <w:tcW w:type="dxa" w:w="1944"/>
+            <w:shd w:fill="17365D"/>
+            <w:vAlign w:val="center"/>
+            <w:tcMar>
+              <w:top w:w="100" w:type="dxa"/>
+              <w:start w:w="120" w:type="dxa"/>
+              <w:bottom w:w="100" w:type="dxa"/>
+              <w:end w:w="120" w:type="dxa"/>
+            </w:tcMar>
+          </w:tcPr>
+          <w:p>
+            <w:pPr>
+              <w:keepNext/>
+              <w:jc w:val="center"/>
+            </w:pPr>
+            <w:r>
+              <w:rPr>
+                <w:b/>
+                <w:color w:val="FFFFFF"/>
+                <w:sz w:val="16"/>
+              </w:rPr>
+              <w:t>Mean score loss</w:t>
+            </w:r>
+          </w:p>
+        </w:tc>
+        <w:tc>
+          <w:tcPr>
+            <w:tcW w:type="dxa" w:w="1944"/>
+            <w:shd w:fill="17365D"/>
+            <w:vAlign w:val="center"/>
+            <w:tcMar>
+              <w:top w:w="100" w:type="dxa"/>
+              <w:start w:w="120" w:type="dxa"/>
+              <w:bottom w:w="100" w:type="dxa"/>
+              <w:end w:w="120" w:type="dxa"/>
+            </w:tcMar>
+          </w:tcPr>
+          <w:p>
+            <w:pPr>
+              <w:keepNext/>
+              <w:jc w:val="center"/>
+            </w:pPr>
+            <w:r>
+              <w:rPr>
+                <w:b/>
+                <w:color w:val="FFFFFF"/>
+                <w:sz w:val="16"/>
+              </w:rPr>
+              <w:t>Maximum score loss</w:t>
+            </w:r>
+          </w:p>
+        </w:tc>
+      </w:tr>
+      <w:tr>
+        <w:trPr>
+          <w:cantSplit/>
+        </w:trPr>
+        <w:tc>
+          <w:tcPr>
+            <w:tcW w:type="dxa" w:w="3024"/>
+            <w:vAlign w:val="center"/>
+            <w:tcMar>
+              <w:top w:w="100" w:type="dxa"/>
+              <w:start w:w="120" w:type="dxa"/>
+              <w:bottom w:w="100" w:type="dxa"/>
+              <w:end w:w="120" w:type="dxa"/>
+            </w:tcMar>
+          </w:tcPr>
+          <w:p>
+            <w:pPr>
+              <w:spacing w:after="0"/>
+              <w:jc w:val="left"/>
+            </w:pPr>
+            <w:r>
+              <w:rPr>
+                <w:sz w:val="16"/>
+              </w:rPr>
+              <w:t>Neutral rank 1</w:t>
+            </w:r>
+          </w:p>
+        </w:tc>
+        <w:tc>
+          <w:tcPr>
+            <w:tcW w:type="dxa" w:w="3168"/>
+            <w:vAlign w:val="center"/>
+            <w:tcMar>
+              <w:top w:w="100" w:type="dxa"/>
+              <w:start w:w="120" w:type="dxa"/>
+              <w:bottom w:w="100" w:type="dxa"/>
+              <w:end w:w="120" w:type="dxa"/>
+            </w:tcMar>
+          </w:tcPr>
+          <w:p>
+            <w:pPr>
+              <w:spacing w:after="0"/>
+              <w:jc w:val="center"/>
+            </w:pPr>
+            <w:r>
+              <w:rPr>
+                <w:sz w:val="16"/>
+              </w:rPr>
+              <w:t>0 (0.0%)</w:t>
+            </w:r>
+          </w:p>
+        </w:tc>
+        <w:tc>
+          <w:tcPr>
+            <w:tcW w:type="dxa" w:w="1944"/>
+            <w:vAlign w:val="center"/>
+            <w:tcMar>
+              <w:top w:w="100" w:type="dxa"/>
+              <w:start w:w="120" w:type="dxa"/>
+              <w:bottom w:w="100" w:type="dxa"/>
+              <w:end w:w="120" w:type="dxa"/>
+            </w:tcMar>
+          </w:tcPr>
+          <w:p>
+            <w:pPr>
+              <w:spacing w:after="0"/>
+              <w:jc w:val="center"/>
+            </w:pPr>
+            <w:r>
+              <w:rPr>
+                <w:sz w:val="16"/>
+              </w:rPr>
+              <w:t>0.00 cp</w:t>
+            </w:r>
+          </w:p>
+        </w:tc>
+        <w:tc>
+          <w:tcPr>
+            <w:tcW w:type="dxa" w:w="1944"/>
+            <w:vAlign w:val="center"/>
+            <w:tcMar>
+              <w:top w:w="100" w:type="dxa"/>
+              <w:start w:w="120" w:type="dxa"/>
+              <w:bottom w:w="100" w:type="dxa"/>
+              <w:end w:w="120" w:type="dxa"/>
+            </w:tcMar>
+          </w:tcPr>
+          <w:p>
+            <w:pPr>
+              <w:spacing w:after="0"/>
+              <w:jc w:val="center"/>
+            </w:pPr>
+            <w:r>
+              <w:rPr>
+                <w:sz w:val="16"/>
+              </w:rPr>
+              <w:t>0 cp</w:t>
+            </w:r>
+          </w:p>
+        </w:tc>
+      </w:tr>
+      <w:tr>
+        <w:trPr>
+          <w:cantSplit/>
+        </w:trPr>
+        <w:tc>
+          <w:tcPr>
+            <w:tcW w:type="dxa" w:w="3024"/>
+            <w:vAlign w:val="center"/>
+            <w:tcMar>
+              <w:top w:w="100" w:type="dxa"/>
+              <w:start w:w="120" w:type="dxa"/>
+              <w:bottom w:w="100" w:type="dxa"/>
+              <w:end w:w="120" w:type="dxa"/>
+            </w:tcMar>
+            <w:shd w:fill="F3F7FB"/>
+          </w:tcPr>
+          <w:p>
+            <w:pPr>
+              <w:spacing w:after="0"/>
+              <w:jc w:val="left"/>
+            </w:pPr>
+            <w:r>
+              <w:rPr>
+                <w:sz w:val="16"/>
+              </w:rPr>
+              <w:t>Population boosting</w:t>
+            </w:r>
+          </w:p>
+        </w:tc>
+        <w:tc>
+          <w:tcPr>
+            <w:tcW w:type="dxa" w:w="3168"/>
+            <w:vAlign w:val="center"/>
+            <w:tcMar>
+              <w:top w:w="100" w:type="dxa"/>
+              <w:start w:w="120" w:type="dxa"/>
+              <w:bottom w:w="100" w:type="dxa"/>
+              <w:end w:w="120" w:type="dxa"/>
+            </w:tcMar>
+            <w:shd w:fill="F3F7FB"/>
+          </w:tcPr>
+          <w:p>
+            <w:pPr>
+              <w:spacing w:after="0"/>
+              <w:jc w:val="center"/>
+            </w:pPr>
+            <w:r>
+              <w:rPr>
+                <w:sz w:val="16"/>
+              </w:rPr>
+              <w:t>2 (6.25%)</w:t>
+            </w:r>
+          </w:p>
+        </w:tc>
+        <w:tc>
+          <w:tcPr>
+            <w:tcW w:type="dxa" w:w="1944"/>
+            <w:vAlign w:val="center"/>
+            <w:tcMar>
+              <w:top w:w="100" w:type="dxa"/>
+              <w:start w:w="120" w:type="dxa"/>
+              <w:bottom w:w="100" w:type="dxa"/>
+              <w:end w:w="120" w:type="dxa"/>
+            </w:tcMar>
+            <w:shd w:fill="F3F7FB"/>
+          </w:tcPr>
+          <w:p>
+            <w:pPr>
+              <w:spacing w:after="0"/>
+              <w:jc w:val="center"/>
+            </w:pPr>
+            <w:r>
+              <w:rPr>
+                <w:sz w:val="16"/>
+              </w:rPr>
+              <w:t>0.25 cp</w:t>
+            </w:r>
+          </w:p>
+        </w:tc>
+        <w:tc>
+          <w:tcPr>
+            <w:tcW w:type="dxa" w:w="1944"/>
+            <w:vAlign w:val="center"/>
+            <w:tcMar>
+              <w:top w:w="100" w:type="dxa"/>
+              <w:start w:w="120" w:type="dxa"/>
+              <w:bottom w:w="100" w:type="dxa"/>
+              <w:end w:w="120" w:type="dxa"/>
+            </w:tcMar>
+            <w:shd w:fill="F3F7FB"/>
+          </w:tcPr>
+          <w:p>
+            <w:pPr>
+              <w:spacing w:after="0"/>
+              <w:jc w:val="center"/>
+            </w:pPr>
+            <w:r>
+              <w:rPr>
+                <w:sz w:val="16"/>
+              </w:rPr>
+              <w:t>8 cp</w:t>
+            </w:r>
+          </w:p>
+        </w:tc>
+      </w:tr>
+      <w:tr>
+        <w:trPr>
+          <w:cantSplit/>
+        </w:trPr>
+        <w:tc>
+          <w:tcPr>
+            <w:tcW w:type="dxa" w:w="3024"/>
+            <w:vAlign w:val="center"/>
+            <w:tcMar>
+              <w:top w:w="100" w:type="dxa"/>
+              <w:start w:w="120" w:type="dxa"/>
+              <w:bottom w:w="100" w:type="dxa"/>
+              <w:end w:w="120" w:type="dxa"/>
+            </w:tcMar>
+          </w:tcPr>
+          <w:p>
+            <w:pPr>
+              <w:spacing w:after="0"/>
+              <w:jc w:val="left"/>
+            </w:pPr>
+            <w:r>
+              <w:rPr>
+                <w:sz w:val="16"/>
+              </w:rPr>
+              <w:t>Personal lifetime boosting</w:t>
+            </w:r>
+          </w:p>
+        </w:tc>
+        <w:tc>
+          <w:tcPr>
+            <w:tcW w:type="dxa" w:w="3168"/>
+            <w:vAlign w:val="center"/>
+            <w:tcMar>
+              <w:top w:w="100" w:type="dxa"/>
+              <w:start w:w="120" w:type="dxa"/>
+              <w:bottom w:w="100" w:type="dxa"/>
+              <w:end w:w="120" w:type="dxa"/>
+            </w:tcMar>
+          </w:tcPr>
+          <w:p>
+            <w:pPr>
+              <w:spacing w:after="0"/>
+              <w:jc w:val="center"/>
+            </w:pPr>
+            <w:r>
+              <w:rPr>
+                <w:sz w:val="16"/>
+              </w:rPr>
+              <w:t>1 (3.13%)</w:t>
+            </w:r>
+          </w:p>
+        </w:tc>
+        <w:tc>
+          <w:tcPr>
+            <w:tcW w:type="dxa" w:w="1944"/>
+            <w:vAlign w:val="center"/>
+            <w:tcMar>
+              <w:top w:w="100" w:type="dxa"/>
+              <w:start w:w="120" w:type="dxa"/>
+              <w:bottom w:w="100" w:type="dxa"/>
+              <w:end w:w="120" w:type="dxa"/>
+            </w:tcMar>
+          </w:tcPr>
+          <w:p>
+            <w:pPr>
+              <w:spacing w:after="0"/>
+              <w:jc w:val="center"/>
+            </w:pPr>
+            <w:r>
+              <w:rPr>
+                <w:sz w:val="16"/>
+              </w:rPr>
+              <w:t>0.03 cp</w:t>
+            </w:r>
+          </w:p>
+        </w:tc>
+        <w:tc>
+          <w:tcPr>
+            <w:tcW w:type="dxa" w:w="1944"/>
+            <w:vAlign w:val="center"/>
+            <w:tcMar>
+              <w:top w:w="100" w:type="dxa"/>
+              <w:start w:w="120" w:type="dxa"/>
+              <w:bottom w:w="100" w:type="dxa"/>
+              <w:end w:w="120" w:type="dxa"/>
+            </w:tcMar>
+          </w:tcPr>
+          <w:p>
+            <w:pPr>
+              <w:spacing w:after="0"/>
+              <w:jc w:val="center"/>
+            </w:pPr>
+            <w:r>
+              <w:rPr>
+                <w:sz w:val="16"/>
+              </w:rPr>
+              <w:t>1 cp</w:t>
+            </w:r>
+          </w:p>
+        </w:tc>
+      </w:tr>
+      <w:tr>
+        <w:trPr>
+          <w:cantSplit/>
+        </w:trPr>
+        <w:tc>
+          <w:tcPr>
+            <w:tcW w:type="dxa" w:w="3024"/>
+            <w:vAlign w:val="center"/>
+            <w:tcMar>
+              <w:top w:w="100" w:type="dxa"/>
+              <w:start w:w="120" w:type="dxa"/>
+              <w:bottom w:w="100" w:type="dxa"/>
+              <w:end w:w="120" w:type="dxa"/>
+            </w:tcMar>
+            <w:shd w:fill="F3F7FB"/>
+          </w:tcPr>
+          <w:p>
+            <w:pPr>
+              <w:spacing w:after="0"/>
+              <w:jc w:val="left"/>
+            </w:pPr>
+            <w:r>
+              <w:rPr>
+                <w:sz w:val="16"/>
+              </w:rPr>
+              <w:t>Deterministic random-safe</w:t>
+            </w:r>
+          </w:p>
+        </w:tc>
+        <w:tc>
+          <w:tcPr>
+            <w:tcW w:type="dxa" w:w="3168"/>
+            <w:vAlign w:val="center"/>
+            <w:tcMar>
+              <w:top w:w="100" w:type="dxa"/>
+              <w:start w:w="120" w:type="dxa"/>
+              <w:bottom w:w="100" w:type="dxa"/>
+              <w:end w:w="120" w:type="dxa"/>
+            </w:tcMar>
+            <w:shd w:fill="F3F7FB"/>
+          </w:tcPr>
+          <w:p>
+            <w:pPr>
+              <w:spacing w:after="0"/>
+              <w:jc w:val="center"/>
+            </w:pPr>
+            <w:r>
+              <w:rPr>
+                <w:sz w:val="16"/>
+              </w:rPr>
+              <w:t>11 (34.38%)</w:t>
+            </w:r>
+          </w:p>
+        </w:tc>
+        <w:tc>
+          <w:tcPr>
+            <w:tcW w:type="dxa" w:w="1944"/>
+            <w:vAlign w:val="center"/>
+            <w:tcMar>
+              <w:top w:w="100" w:type="dxa"/>
+              <w:start w:w="120" w:type="dxa"/>
+              <w:bottom w:w="100" w:type="dxa"/>
+              <w:end w:w="120" w:type="dxa"/>
+            </w:tcMar>
+            <w:shd w:fill="F3F7FB"/>
+          </w:tcPr>
+          <w:p>
+            <w:pPr>
+              <w:spacing w:after="0"/>
+              <w:jc w:val="center"/>
+            </w:pPr>
+            <w:r>
+              <w:rPr>
+                <w:sz w:val="16"/>
+              </w:rPr>
+              <w:t>1.47 cp</w:t>
+            </w:r>
+          </w:p>
+        </w:tc>
+        <w:tc>
+          <w:tcPr>
+            <w:tcW w:type="dxa" w:w="1944"/>
+            <w:vAlign w:val="center"/>
+            <w:tcMar>
+              <w:top w:w="100" w:type="dxa"/>
+              <w:start w:w="120" w:type="dxa"/>
+              <w:bottom w:w="100" w:type="dxa"/>
+              <w:end w:w="120" w:type="dxa"/>
+            </w:tcMar>
+            <w:shd w:fill="F3F7FB"/>
+          </w:tcPr>
+          <w:p>
+            <w:pPr>
+              <w:spacing w:after="0"/>
+              <w:jc w:val="center"/>
+            </w:pPr>
+            <w:r>
+              <w:rPr>
+                <w:sz w:val="16"/>
+              </w:rPr>
+              <w:t>15 cp</w:t>
+            </w:r>
+          </w:p>
+        </w:tc>
+      </w:tr>
+    </w:tbl>
+    <w:p>
+      <w:pPr>
+        <w:spacing w:after="20"/>
+      </w:pPr>
+    </w:p>
+    <w:p>
+      <w:r>
+        <w:t>All four arms consumed identical candidates and scores at 20,000 nodes, with zero mismatches. The personal policy is operational but conservative: only one of 32 held-out historical opponent-turn positions changed, at a one-centipawn search cost.</w:t>
+      </w:r>
+    </w:p>
+    <w:tbl>
+      <w:tblPr>
+        <w:tblStyle w:val="TableGrid"/>
+        <w:tblW w:type="auto" w:w="0"/>
+        <w:jc w:val="center"/>
+        <w:tblLayout w:type="fixed"/>
+        <w:tblLook w:firstColumn="1" w:firstRow="1" w:lastColumn="0" w:lastRow="0" w:noHBand="0" w:noVBand="1" w:val="04A0"/>
+      </w:tblPr>
+      <w:tblGrid>
+        <w:gridCol w:w="2469"/>
+        <w:gridCol w:w="2469"/>
+        <w:gridCol w:w="2469"/>
+        <w:gridCol w:w="2469"/>
+      </w:tblGrid>
+      <w:tr>
+        <w:trPr>
+          <w:tblHeader w:val="true"/>
+          <w:cantSplit/>
+        </w:trPr>
+        <w:tc>
+          <w:tcPr>
+            <w:tcW w:type="dxa" w:w="1944"/>
+            <w:shd w:fill="17365D"/>
+            <w:vAlign w:val="center"/>
+            <w:tcMar>
+              <w:top w:w="100" w:type="dxa"/>
+              <w:start w:w="120" w:type="dxa"/>
+              <w:bottom w:w="100" w:type="dxa"/>
+              <w:end w:w="120" w:type="dxa"/>
+            </w:tcMar>
+          </w:tcPr>
+          <w:p>
+            <w:pPr>
+              <w:keepNext/>
+              <w:jc w:val="center"/>
+            </w:pPr>
+            <w:r>
+              <w:rPr>
+                <w:b/>
+                <w:color w:val="FFFFFF"/>
+                <w:sz w:val="15"/>
+              </w:rPr>
+              <w:t>Policy</w:t>
+            </w:r>
+          </w:p>
+        </w:tc>
+        <w:tc>
+          <w:tcPr>
+            <w:tcW w:type="dxa" w:w="3096"/>
+            <w:shd w:fill="17365D"/>
+            <w:vAlign w:val="center"/>
+            <w:tcMar>
+              <w:top w:w="100" w:type="dxa"/>
+              <w:start w:w="120" w:type="dxa"/>
+              <w:bottom w:w="100" w:type="dxa"/>
+              <w:end w:w="120" w:type="dxa"/>
+            </w:tcMar>
+          </w:tcPr>
+          <w:p>
+            <w:pPr>
+              <w:keepNext/>
+              <w:jc w:val="center"/>
+            </w:pPr>
+            <w:r>
+              <w:rPr>
+                <w:b/>
+                <w:color w:val="FFFFFF"/>
+                <w:sz w:val="15"/>
+              </w:rPr>
+              <w:t>W-D-L versus 1164-limited Stockfish</w:t>
+            </w:r>
+          </w:p>
+        </w:tc>
+        <w:tc>
+          <w:tcPr>
+            <w:tcW w:type="dxa" w:w="1440"/>
+            <w:shd w:fill="17365D"/>
+            <w:vAlign w:val="center"/>
+            <w:tcMar>
+              <w:top w:w="100" w:type="dxa"/>
+              <w:start w:w="120" w:type="dxa"/>
+              <w:bottom w:w="100" w:type="dxa"/>
+              <w:end w:w="120" w:type="dxa"/>
+            </w:tcMar>
+          </w:tcPr>
+          <w:p>
+            <w:pPr>
+              <w:keepNext/>
+              <w:jc w:val="center"/>
+            </w:pPr>
+            <w:r>
+              <w:rPr>
+                <w:b/>
+                <w:color w:val="FFFFFF"/>
+                <w:sz w:val="15"/>
+              </w:rPr>
+              <w:t>Score</w:t>
+            </w:r>
+          </w:p>
+        </w:tc>
+        <w:tc>
+          <w:tcPr>
+            <w:tcW w:type="dxa" w:w="3600"/>
+            <w:shd w:fill="17365D"/>
+            <w:vAlign w:val="center"/>
+            <w:tcMar>
+              <w:top w:w="100" w:type="dxa"/>
+              <w:start w:w="120" w:type="dxa"/>
+              <w:bottom w:w="100" w:type="dxa"/>
+              <w:end w:w="120" w:type="dxa"/>
+            </w:tcMar>
+          </w:tcPr>
+          <w:p>
+            <w:pPr>
+              <w:keepNext/>
+              <w:jc w:val="center"/>
+            </w:pPr>
+            <w:r>
+              <w:rPr>
+                <w:b/>
+                <w:color w:val="FFFFFF"/>
+                <w:sz w:val="15"/>
+              </w:rPr>
+              <w:t>Difference versus neutral (95% interval)</w:t>
+            </w:r>
+          </w:p>
+        </w:tc>
+      </w:tr>
+      <w:tr>
+        <w:trPr>
+          <w:cantSplit/>
+        </w:trPr>
+        <w:tc>
+          <w:tcPr>
+            <w:tcW w:type="dxa" w:w="1944"/>
+            <w:vAlign w:val="center"/>
+            <w:tcMar>
+              <w:top w:w="100" w:type="dxa"/>
+              <w:start w:w="120" w:type="dxa"/>
+              <w:bottom w:w="100" w:type="dxa"/>
+              <w:end w:w="120" w:type="dxa"/>
+            </w:tcMar>
+          </w:tcPr>
+          <w:p>
+            <w:pPr>
+              <w:spacing w:after="0"/>
+              <w:jc w:val="left"/>
+            </w:pPr>
+            <w:r>
+              <w:rPr>
+                <w:sz w:val="15"/>
+              </w:rPr>
+              <w:t>Neutral</w:t>
+            </w:r>
+          </w:p>
+        </w:tc>
+        <w:tc>
+          <w:tcPr>
+            <w:tcW w:type="dxa" w:w="3096"/>
+            <w:vAlign w:val="center"/>
+            <w:tcMar>
+              <w:top w:w="100" w:type="dxa"/>
+              <w:start w:w="120" w:type="dxa"/>
+              <w:bottom w:w="100" w:type="dxa"/>
+              <w:end w:w="120" w:type="dxa"/>
+            </w:tcMar>
+          </w:tcPr>
+          <w:p>
+            <w:pPr>
+              <w:spacing w:after="0"/>
+              <w:jc w:val="center"/>
+            </w:pPr>
+            <w:r>
+              <w:rPr>
+                <w:sz w:val="15"/>
+              </w:rPr>
+              <w:t>11-5-0</w:t>
+            </w:r>
+          </w:p>
+        </w:tc>
+        <w:tc>
+          <w:tcPr>
+            <w:tcW w:type="dxa" w:w="1440"/>
+            <w:vAlign w:val="center"/>
+            <w:tcMar>
+              <w:top w:w="100" w:type="dxa"/>
+              <w:start w:w="120" w:type="dxa"/>
+              <w:bottom w:w="100" w:type="dxa"/>
+              <w:end w:w="120" w:type="dxa"/>
+            </w:tcMar>
+          </w:tcPr>
+          <w:p>
+            <w:pPr>
+              <w:spacing w:after="0"/>
+              <w:jc w:val="center"/>
+            </w:pPr>
+            <w:r>
+              <w:rPr>
+                <w:sz w:val="15"/>
+              </w:rPr>
+              <w:t>84.38%</w:t>
+            </w:r>
+          </w:p>
+        </w:tc>
+        <w:tc>
+          <w:tcPr>
+            <w:tcW w:type="dxa" w:w="3600"/>
+            <w:vAlign w:val="center"/>
+            <w:tcMar>
+              <w:top w:w="100" w:type="dxa"/>
+              <w:start w:w="120" w:type="dxa"/>
+              <w:bottom w:w="100" w:type="dxa"/>
+              <w:end w:w="120" w:type="dxa"/>
+            </w:tcMar>
+          </w:tcPr>
+          <w:p>
+            <w:pPr>
+              <w:spacing w:after="0"/>
+              <w:jc w:val="center"/>
+            </w:pPr>
+            <w:r>
+              <w:rPr>
+                <w:sz w:val="15"/>
+              </w:rPr>
+              <w:t>reference</w:t>
+            </w:r>
+          </w:p>
+        </w:tc>
+      </w:tr>
+      <w:tr>
+        <w:trPr>
+          <w:cantSplit/>
+        </w:trPr>
+        <w:tc>
+          <w:tcPr>
+            <w:tcW w:type="dxa" w:w="1944"/>
+            <w:vAlign w:val="center"/>
+            <w:tcMar>
+              <w:top w:w="100" w:type="dxa"/>
+              <w:start w:w="120" w:type="dxa"/>
+              <w:bottom w:w="100" w:type="dxa"/>
+              <w:end w:w="120" w:type="dxa"/>
+            </w:tcMar>
+            <w:shd w:fill="F3F7FB"/>
+          </w:tcPr>
+          <w:p>
+            <w:pPr>
+              <w:spacing w:after="0"/>
+              <w:jc w:val="left"/>
+            </w:pPr>
+            <w:r>
+              <w:rPr>
+                <w:sz w:val="15"/>
+              </w:rPr>
+              <w:t>Population</w:t>
+            </w:r>
+          </w:p>
+        </w:tc>
+        <w:tc>
+          <w:tcPr>
+            <w:tcW w:type="dxa" w:w="3096"/>
+            <w:vAlign w:val="center"/>
+            <w:tcMar>
+              <w:top w:w="100" w:type="dxa"/>
+              <w:start w:w="120" w:type="dxa"/>
+              <w:bottom w:w="100" w:type="dxa"/>
+              <w:end w:w="120" w:type="dxa"/>
+            </w:tcMar>
+            <w:shd w:fill="F3F7FB"/>
+          </w:tcPr>
+          <w:p>
+            <w:pPr>
+              <w:spacing w:after="0"/>
+              <w:jc w:val="center"/>
+            </w:pPr>
+            <w:r>
+              <w:rPr>
+                <w:sz w:val="15"/>
+              </w:rPr>
+              <w:t>11-4-1</w:t>
+            </w:r>
+          </w:p>
+        </w:tc>
+        <w:tc>
+          <w:tcPr>
+            <w:tcW w:type="dxa" w:w="1440"/>
+            <w:vAlign w:val="center"/>
+            <w:tcMar>
+              <w:top w:w="100" w:type="dxa"/>
+              <w:start w:w="120" w:type="dxa"/>
+              <w:bottom w:w="100" w:type="dxa"/>
+              <w:end w:w="120" w:type="dxa"/>
+            </w:tcMar>
+            <w:shd w:fill="F3F7FB"/>
+          </w:tcPr>
+          <w:p>
+            <w:pPr>
+              <w:spacing w:after="0"/>
+              <w:jc w:val="center"/>
+            </w:pPr>
+            <w:r>
+              <w:rPr>
+                <w:sz w:val="15"/>
+              </w:rPr>
+              <w:t>81.25%</w:t>
+            </w:r>
+          </w:p>
+        </w:tc>
+        <w:tc>
+          <w:tcPr>
+            <w:tcW w:type="dxa" w:w="3600"/>
+            <w:vAlign w:val="center"/>
+            <w:tcMar>
+              <w:top w:w="100" w:type="dxa"/>
+              <w:start w:w="120" w:type="dxa"/>
+              <w:bottom w:w="100" w:type="dxa"/>
+              <w:end w:w="120" w:type="dxa"/>
+            </w:tcMar>
+            <w:shd w:fill="F3F7FB"/>
+          </w:tcPr>
+          <w:p>
+            <w:pPr>
+              <w:spacing w:after="0"/>
+              <w:jc w:val="center"/>
+            </w:pPr>
+            <w:r>
+              <w:rPr>
+                <w:sz w:val="15"/>
+              </w:rPr>
+              <w:t>-3.13 pp (-21.88, +15.63)</w:t>
+            </w:r>
+          </w:p>
+        </w:tc>
+      </w:tr>
+      <w:tr>
+        <w:trPr>
+          <w:cantSplit/>
+        </w:trPr>
+        <w:tc>
+          <w:tcPr>
+            <w:tcW w:type="dxa" w:w="1944"/>
+            <w:vAlign w:val="center"/>
+            <w:tcMar>
+              <w:top w:w="100" w:type="dxa"/>
+              <w:start w:w="120" w:type="dxa"/>
+              <w:bottom w:w="100" w:type="dxa"/>
+              <w:end w:w="120" w:type="dxa"/>
+            </w:tcMar>
+          </w:tcPr>
+          <w:p>
+            <w:pPr>
+              <w:spacing w:after="0"/>
+              <w:jc w:val="left"/>
+            </w:pPr>
+            <w:r>
+              <w:rPr>
+                <w:sz w:val="15"/>
+              </w:rPr>
+              <w:t>Personal</w:t>
+            </w:r>
+          </w:p>
+        </w:tc>
+        <w:tc>
+          <w:tcPr>
+            <w:tcW w:type="dxa" w:w="3096"/>
+            <w:vAlign w:val="center"/>
+            <w:tcMar>
+              <w:top w:w="100" w:type="dxa"/>
+              <w:start w:w="120" w:type="dxa"/>
+              <w:bottom w:w="100" w:type="dxa"/>
+              <w:end w:w="120" w:type="dxa"/>
+            </w:tcMar>
+          </w:tcPr>
+          <w:p>
+            <w:pPr>
+              <w:spacing w:after="0"/>
+              <w:jc w:val="center"/>
+            </w:pPr>
+            <w:r>
+              <w:rPr>
+                <w:sz w:val="15"/>
+              </w:rPr>
+              <w:t>12-4-0</w:t>
+            </w:r>
+          </w:p>
+        </w:tc>
+        <w:tc>
+          <w:tcPr>
+            <w:tcW w:type="dxa" w:w="1440"/>
+            <w:vAlign w:val="center"/>
+            <w:tcMar>
+              <w:top w:w="100" w:type="dxa"/>
+              <w:start w:w="120" w:type="dxa"/>
+              <w:bottom w:w="100" w:type="dxa"/>
+              <w:end w:w="120" w:type="dxa"/>
+            </w:tcMar>
+          </w:tcPr>
+          <w:p>
+            <w:pPr>
+              <w:spacing w:after="0"/>
+              <w:jc w:val="center"/>
+            </w:pPr>
+            <w:r>
+              <w:rPr>
+                <w:sz w:val="15"/>
+              </w:rPr>
+              <w:t>87.50%</w:t>
+            </w:r>
+          </w:p>
+        </w:tc>
+        <w:tc>
+          <w:tcPr>
+            <w:tcW w:type="dxa" w:w="3600"/>
+            <w:vAlign w:val="center"/>
+            <w:tcMar>
+              <w:top w:w="100" w:type="dxa"/>
+              <w:start w:w="120" w:type="dxa"/>
+              <w:bottom w:w="100" w:type="dxa"/>
+              <w:end w:w="120" w:type="dxa"/>
+            </w:tcMar>
+          </w:tcPr>
+          <w:p>
+            <w:pPr>
+              <w:spacing w:after="0"/>
+              <w:jc w:val="center"/>
+            </w:pPr>
+            <w:r>
+              <w:rPr>
+                <w:sz w:val="15"/>
+              </w:rPr>
+              <w:t>+3.13 pp (-12.50, +18.75)</w:t>
+            </w:r>
+          </w:p>
+        </w:tc>
+      </w:tr>
+      <w:tr>
+        <w:trPr>
+          <w:cantSplit/>
+        </w:trPr>
+        <w:tc>
+          <w:tcPr>
+            <w:tcW w:type="dxa" w:w="1944"/>
+            <w:vAlign w:val="center"/>
+            <w:tcMar>
+              <w:top w:w="100" w:type="dxa"/>
+              <w:start w:w="120" w:type="dxa"/>
+              <w:bottom w:w="100" w:type="dxa"/>
+              <w:end w:w="120" w:type="dxa"/>
+            </w:tcMar>
+            <w:shd w:fill="F3F7FB"/>
+          </w:tcPr>
+          <w:p>
+            <w:pPr>
+              <w:spacing w:after="0"/>
+              <w:jc w:val="left"/>
+            </w:pPr>
+            <w:r>
+              <w:rPr>
+                <w:sz w:val="15"/>
+              </w:rPr>
+              <w:t>Random-safe</w:t>
+            </w:r>
+          </w:p>
+        </w:tc>
+        <w:tc>
+          <w:tcPr>
+            <w:tcW w:type="dxa" w:w="3096"/>
+            <w:vAlign w:val="center"/>
+            <w:tcMar>
+              <w:top w:w="100" w:type="dxa"/>
+              <w:start w:w="120" w:type="dxa"/>
+              <w:bottom w:w="100" w:type="dxa"/>
+              <w:end w:w="120" w:type="dxa"/>
+            </w:tcMar>
+            <w:shd w:fill="F3F7FB"/>
+          </w:tcPr>
+          <w:p>
+            <w:pPr>
+              <w:spacing w:after="0"/>
+              <w:jc w:val="center"/>
+            </w:pPr>
+            <w:r>
+              <w:rPr>
+                <w:sz w:val="15"/>
+              </w:rPr>
+              <w:t>9-6-1</w:t>
+            </w:r>
+          </w:p>
+        </w:tc>
+        <w:tc>
+          <w:tcPr>
+            <w:tcW w:type="dxa" w:w="1440"/>
+            <w:vAlign w:val="center"/>
+            <w:tcMar>
+              <w:top w:w="100" w:type="dxa"/>
+              <w:start w:w="120" w:type="dxa"/>
+              <w:bottom w:w="100" w:type="dxa"/>
+              <w:end w:w="120" w:type="dxa"/>
+            </w:tcMar>
+            <w:shd w:fill="F3F7FB"/>
+          </w:tcPr>
+          <w:p>
+            <w:pPr>
+              <w:spacing w:after="0"/>
+              <w:jc w:val="center"/>
+            </w:pPr>
+            <w:r>
+              <w:rPr>
+                <w:sz w:val="15"/>
+              </w:rPr>
+              <w:t>75.00%</w:t>
+            </w:r>
+          </w:p>
+        </w:tc>
+        <w:tc>
+          <w:tcPr>
+            <w:tcW w:type="dxa" w:w="3600"/>
+            <w:vAlign w:val="center"/>
+            <w:tcMar>
+              <w:top w:w="100" w:type="dxa"/>
+              <w:start w:w="120" w:type="dxa"/>
+              <w:bottom w:w="100" w:type="dxa"/>
+              <w:end w:w="120" w:type="dxa"/>
+            </w:tcMar>
+            <w:shd w:fill="F3F7FB"/>
+          </w:tcPr>
+          <w:p>
+            <w:pPr>
+              <w:spacing w:after="0"/>
+              <w:jc w:val="center"/>
+            </w:pPr>
+            <w:r>
+              <w:rPr>
+                <w:sz w:val="15"/>
+              </w:rPr>
+              <w:t>-9.38 pp (-28.13, +6.25)</w:t>
+            </w:r>
+          </w:p>
+        </w:tc>
+      </w:tr>
+    </w:tbl>
+    <w:p>
+      <w:pPr>
+        <w:spacing w:after="20"/>
+      </w:pPr>
+    </w:p>
+    <w:p>
+      <w:r>
+        <w:t>This 64-game safety run found no detectable arm difference; every interval includes zero. It verifies stable, legal, bounded play at equal target nodes. It is not a causal personalization test because limited-strength Stockfish is not Yash and does not express the learned tendencies. Historical replay also cannot reveal how Yash would respond after the engine chooses a counterfactual move.</w:t>
+      </w:r>
+    </w:p>
+    <w:p>
+      <w:pPr>
         <w:pStyle w:val="Heading2"/>
       </w:pPr>
       <w:r>
@@ -8305,7 +9420,7 @@
               <w:rPr>
                 <w:sz w:val="17"/>
               </w:rPr>
-              <w:t>Personalized root selection wins more games at equal compute</w:t>
+              <w:t>Personalized root selection wins more games against Yash at equal compute</w:t>
             </w:r>
           </w:p>
         </w:tc>
@@ -8334,7 +9449,7 @@
               <w:rPr>
                 <w:sz w:val="17"/>
               </w:rPr>
-              <w:t>Linear personalization can be counterproductive under strong player drift</w:t>
+              <w:t>Frozen C++ learned selection is parity-tested, bounded, and conservative</w:t>
             </w:r>
           </w:p>
         </w:tc>
@@ -8358,7 +9473,7 @@
               <w:rPr>
                 <w:sz w:val="17"/>
               </w:rPr>
-              <w:t>A lifetime profile is the best way to deploy personalization</w:t>
+              <w:t>Online refresh improves real match outcomes</w:t>
             </w:r>
           </w:p>
         </w:tc>
@@ -8379,7 +9494,7 @@
     </w:p>
     <w:p>
       <w:r>
-        <w:t>The next phase must translate probability prediction into a frozen playing policy without tuning on the final match set.</w:t>
+        <w:t>The probability model and playing policy are now frozen and parity-tested. The remaining confirmatory phase must measure their effect against the profiled human without tuning on that final match set.</w:t>
       </w:r>
     </w:p>
     <w:p>
@@ -8393,7 +9508,7 @@
         <w:t xml:space="preserve">1. </w:t>
       </w:r>
       <w:r>
-        <w:t>Freeze and export the selected boosting model with an exact feature order, missing-value policy, thresholds, leaf values, and a Python-to-C++ parity test corpus.</w:t>
+        <w:t>Preregister the prospective match sample size, stopping rule, random arm order, color balance, opening policy, time control, and primary score comparison.</w:t>
       </w:r>
     </w:p>
     <w:p>
@@ -8407,7 +9522,7 @@
         <w:t xml:space="preserve">2. </w:t>
       </w:r>
       <w:r>
-        <w:t>Implement C++ inference after each safe MultiPV candidate. Predict the opponent's next-move large-error probability from the resulting position.</w:t>
+        <w:t>Run blinded games in which Yash faces neutral, population, personal, and random-safe arms without knowing the active policy. Preserve identical MultiPV 4 node limits and hardware.</w:t>
       </w:r>
     </w:p>
     <w:p>
@@ -8421,7 +9536,7 @@
         <w:t xml:space="preserve">3. </w:t>
       </w:r>
       <w:r>
-        <w:t>Define and preregister a bounded probability bonus. The 35 cp objective eligibility bound and all mate protections remain authoritative.</w:t>
+        <w:t>Use paired game-level uncertainty or SPRT and report all arms. Do not tune the 100 cp probability scale or 20 cp cap on these games.</w:t>
       </w:r>
     </w:p>
     <w:p>
@@ -8435,7 +9550,7 @@
         <w:t xml:space="preserve">4. </w:t>
       </w:r>
       <w:r>
-        <w:t>Run identical-node, identical-opening, color-swapped comparisons among neutral, population, personalized, wrong-player, and random-safe selectors.</w:t>
+        <w:t>Treat the human result as the causal endpoint. Retrospective prediction and Stockfish safety matches cannot substitute for it.</w:t>
       </w:r>
     </w:p>
     <w:p>
@@ -8449,35 +9564,7 @@
         <w:t xml:space="preserve">5. </w:t>
       </w:r>
       <w:r>
-        <w:t>Use paired game-level uncertainty or SPRT. Do not tune the bonus on the confirmatory match set.</w:t>
-      </w:r>
-    </w:p>
-    <w:p>
-      <w:pPr>
-        <w:ind w:left="317" w:hanging="317"/>
-      </w:pPr>
-      <w:r>
-        <w:rPr>
-          <w:b/>
-        </w:rPr>
-        <w:t xml:space="preserve">6. </w:t>
-      </w:r>
-      <w:r>
-        <w:t>After the profile and policy are frozen, run prospective blinded human games. Retrospective prediction cannot substitute for this causal result.</w:t>
-      </w:r>
-    </w:p>
-    <w:p>
-      <w:pPr>
-        <w:ind w:left="317" w:hanging="317"/>
-      </w:pPr>
-      <w:r>
-        <w:rPr>
-          <w:b/>
-        </w:rPr>
-        <w:t xml:space="preserve">7. </w:t>
-      </w:r>
-      <w:r>
-        <w:t>After the frozen causal match, evaluate a deployment process that periodically relabels completed games and refreshes the lifetime model in preregistered batches.</w:t>
+        <w:t>Only after the frozen causal match, evaluate a deployment process that periodically relabels completed games and refreshes the lifetime model in preregistered 20-game batches.</w:t>
       </w:r>
     </w:p>
     <w:p>
@@ -9221,6 +10308,83 @@
           </w:p>
         </w:tc>
       </w:tr>
+      <w:tr>
+        <w:trPr>
+          <w:cantSplit/>
+        </w:trPr>
+        <w:tc>
+          <w:tcPr>
+            <w:tcW w:type="dxa" w:w="1800"/>
+            <w:vAlign w:val="center"/>
+            <w:tcMar>
+              <w:top w:w="100" w:type="dxa"/>
+              <w:start w:w="120" w:type="dxa"/>
+              <w:bottom w:w="100" w:type="dxa"/>
+              <w:end w:w="120" w:type="dxa"/>
+            </w:tcMar>
+          </w:tcPr>
+          <w:p>
+            <w:pPr>
+              <w:spacing w:after="0"/>
+              <w:jc w:val="left"/>
+            </w:pPr>
+            <w:r>
+              <w:rPr>
+                <w:sz w:val="16"/>
+              </w:rPr>
+              <w:t>30 Sep 2026</w:t>
+            </w:r>
+          </w:p>
+        </w:tc>
+        <w:tc>
+          <w:tcPr>
+            <w:tcW w:type="dxa" w:w="4752"/>
+            <w:vAlign w:val="center"/>
+            <w:tcMar>
+              <w:top w:w="100" w:type="dxa"/>
+              <w:start w:w="120" w:type="dxa"/>
+              <w:bottom w:w="100" w:type="dxa"/>
+              <w:end w:w="120" w:type="dxa"/>
+            </w:tcMar>
+          </w:tcPr>
+          <w:p>
+            <w:pPr>
+              <w:spacing w:after="0"/>
+              <w:jc w:val="center"/>
+            </w:pPr>
+            <w:r>
+              <w:rPr>
+                <w:sz w:val="16"/>
+              </w:rPr>
+              <w:t>Boosting models deployed in bounded C++ selector</w:t>
+            </w:r>
+          </w:p>
+        </w:tc>
+        <w:tc>
+          <w:tcPr>
+            <w:tcW w:type="dxa" w:w="3528"/>
+            <w:vAlign w:val="center"/>
+            <w:tcMar>
+              <w:top w:w="100" w:type="dxa"/>
+              <w:start w:w="120" w:type="dxa"/>
+              <w:bottom w:w="100" w:type="dxa"/>
+              <w:end w:w="120" w:type="dxa"/>
+            </w:tcMar>
+          </w:tcPr>
+          <w:p>
+            <w:pPr>
+              <w:spacing w:after="0"/>
+              <w:jc w:val="center"/>
+            </w:pPr>
+            <w:r>
+              <w:rPr>
+                <w:sz w:val="16"/>
+              </w:rPr>
+              <w:t>Inference and feature parity, 32-position identical-candidate replay, and 64-game safety match</w:t>
+            </w:r>
+          </w:p>
+        </w:tc>
+      </w:tr>
     </w:tbl>
     <w:p>
       <w:pPr>
@@ -9290,7 +10454,7 @@
     </w:p>
     <w:p>
       <w:r>
-        <w:t>This version was assembled from the Git history through commit f3cd286, the repository roadmap and architecture notes, the Elo benchmark, the adaptive experiment contract, the profile and feature specifications, the reference-label stability study, the player-drift report, and the YashDutt7 model-results report. Personal raw games and fitted model artifacts remain outside version control by design.</w:t>
+        <w:t>This version was assembled from the Git history through commit 2dbeaf0 plus the learned-selector milestone documented here, the repository roadmap and architecture notes, the Elo benchmark, the adaptive experiment contract, the profile and feature specifications, the reference-label stability study, the player-drift report, and the YashDutt7 model-results report. Personal raw games remain outside version control; frozen derived tree parameters are checked in with source hashes for reproducibility.</w:t>
       </w:r>
     </w:p>
     <w:sectPr>

</xml_diff>

<commit_message>
Freeze prospective adaptive experiment
</commit_message>
<xml_diff>
--- a/docs/Adaptive_Chess_Engine_Project_Report.docx
+++ b/docs/Adaptive_Chess_Engine_Project_Report.docx
@@ -73,7 +73,7 @@
         <w:t xml:space="preserve">Report version </w:t>
       </w:r>
       <w:r>
-        <w:t>1.0  30 September 2026</w:t>
+        <w:t>1.1  1 October 2026</w:t>
       </w:r>
     </w:p>
     <w:p>
@@ -88,7 +88,7 @@
         <w:t xml:space="preserve">Repository history reviewed </w:t>
       </w:r>
       <w:r>
-        <w:t>All project commits through 2dbeaf0 plus this learned-selector milestone</w:t>
+        <w:t>All project commits through 2326f49 plus this prospective-experiment milestone</w:t>
       </w:r>
     </w:p>
     <w:p/>
@@ -2608,7 +2608,7 @@
         <w:t xml:space="preserve">Current verification </w:t>
       </w:r>
       <w:r>
-        <w:t>117 Python tests passed in the project research environment on 30 September 2026. The C++ implementation also has dedicated suites for position, perft, move generation, search, pruning, timing, MultiPV, adaptive features, model-inference parity, and adaptive selection.</w:t>
+        <w:t>122 Python tests passed in the project research environment on 1 October 2026. The C++ implementation also has dedicated suites for position, perft, move generation, search, pruning, timing, MultiPV, adaptive features, model-inference parity, and adaptive selection.</w:t>
       </w:r>
     </w:p>
     <w:p>
@@ -8024,7 +8024,7 @@
     </w:p>
     <w:p>
       <w:r>
-        <w:t>The lifetime personal and population boosting models were exported as deterministic C++ tree data with source hashes, exact feature order, thresholds, missing-value directions, and leaf values. C++ probabilities match sklearn to within 1e-12 on a parity corpus, and a board fixture matches all 17 Python position features. The fixed exploitation adjustment is 100 centipawns per unit probability difference, capped at plus or minus 20 cp; the existing 35 cp eligibility bound and mate protections remain authoritative.</w:t>
+        <w:t>The lifetime personal and population boosting models were exported as deterministic C++ tree data with source hashes, exact feature order, thresholds, missing-value directions, and leaf values. C++ probabilities match sklearn to within 1e-12 on a parity corpus, and a board fixture matches all 17 Python position features. The initial safety adjustment was 100 centipawns per unit probability difference, capped at plus or minus 20 cp; the existing 35 cp eligibility bound and mate protections remained authoritative. Section 10.3 records the later validation-only prospective freeze.</w:t>
       </w:r>
     </w:p>
     <w:tbl>
@@ -9131,6 +9131,1100 @@
     </w:p>
     <w:p>
       <w:pPr>
+        <w:pStyle w:val="Heading3"/>
+      </w:pPr>
+      <w:r>
+        <w:t>10.3 Validation-only final policy selection</w:t>
+      </w:r>
+    </w:p>
+    <w:p>
+      <w:r>
+        <w:t>Because the initial policy changed too few moves, a separate chronological validation candidate corpus was used before any prospective human outcome. Of 256 sampled historical opponent-turn positions, 231 had at least eight candidates. Each was searched once at 20,000 nodes, producing 1,848 candidate rows reused across the complete policy grid.</w:t>
+      </w:r>
+    </w:p>
+    <w:tbl>
+      <w:tblPr>
+        <w:tblStyle w:val="TableGrid"/>
+        <w:tblW w:type="auto" w:w="0"/>
+        <w:jc w:val="center"/>
+        <w:tblLayout w:type="fixed"/>
+        <w:tblLook w:firstColumn="1" w:firstRow="1" w:lastColumn="0" w:lastRow="0" w:noHBand="0" w:noVBand="1" w:val="04A0"/>
+      </w:tblPr>
+      <w:tblGrid>
+        <w:gridCol w:w="3293"/>
+        <w:gridCol w:w="3293"/>
+        <w:gridCol w:w="3293"/>
+      </w:tblGrid>
+      <w:tr>
+        <w:trPr>
+          <w:tblHeader w:val="true"/>
+          <w:cantSplit/>
+        </w:trPr>
+        <w:tc>
+          <w:tcPr>
+            <w:tcW w:type="dxa" w:w="2592"/>
+            <w:shd w:fill="17365D"/>
+            <w:vAlign w:val="center"/>
+            <w:tcMar>
+              <w:top w:w="100" w:type="dxa"/>
+              <w:start w:w="120" w:type="dxa"/>
+              <w:bottom w:w="100" w:type="dxa"/>
+              <w:end w:w="120" w:type="dxa"/>
+            </w:tcMar>
+          </w:tcPr>
+          <w:p>
+            <w:pPr>
+              <w:keepNext/>
+              <w:jc w:val="center"/>
+            </w:pPr>
+            <w:r>
+              <w:rPr>
+                <w:b/>
+                <w:color w:val="FFFFFF"/>
+                <w:sz w:val="15"/>
+              </w:rPr>
+              <w:t>Frozen prospective setting</w:t>
+            </w:r>
+          </w:p>
+        </w:tc>
+        <w:tc>
+          <w:tcPr>
+            <w:tcW w:type="dxa" w:w="2592"/>
+            <w:shd w:fill="17365D"/>
+            <w:vAlign w:val="center"/>
+            <w:tcMar>
+              <w:top w:w="100" w:type="dxa"/>
+              <w:start w:w="120" w:type="dxa"/>
+              <w:bottom w:w="100" w:type="dxa"/>
+              <w:end w:w="120" w:type="dxa"/>
+            </w:tcMar>
+          </w:tcPr>
+          <w:p>
+            <w:pPr>
+              <w:keepNext/>
+              <w:jc w:val="center"/>
+            </w:pPr>
+            <w:r>
+              <w:rPr>
+                <w:b/>
+                <w:color w:val="FFFFFF"/>
+                <w:sz w:val="15"/>
+              </w:rPr>
+              <w:t>Selected value</w:t>
+            </w:r>
+          </w:p>
+        </w:tc>
+        <w:tc>
+          <w:tcPr>
+            <w:tcW w:type="dxa" w:w="4896"/>
+            <w:shd w:fill="17365D"/>
+            <w:vAlign w:val="center"/>
+            <w:tcMar>
+              <w:top w:w="100" w:type="dxa"/>
+              <w:start w:w="120" w:type="dxa"/>
+              <w:bottom w:w="100" w:type="dxa"/>
+              <w:end w:w="120" w:type="dxa"/>
+            </w:tcMar>
+          </w:tcPr>
+          <w:p>
+            <w:pPr>
+              <w:keepNext/>
+              <w:jc w:val="center"/>
+            </w:pPr>
+            <w:r>
+              <w:rPr>
+                <w:b/>
+                <w:color w:val="FFFFFF"/>
+                <w:sz w:val="15"/>
+              </w:rPr>
+              <w:t>Validation evidence</w:t>
+            </w:r>
+          </w:p>
+        </w:tc>
+      </w:tr>
+      <w:tr>
+        <w:trPr>
+          <w:cantSplit/>
+        </w:trPr>
+        <w:tc>
+          <w:tcPr>
+            <w:tcW w:type="dxa" w:w="2592"/>
+            <w:vAlign w:val="center"/>
+            <w:tcMar>
+              <w:top w:w="100" w:type="dxa"/>
+              <w:start w:w="120" w:type="dxa"/>
+              <w:bottom w:w="100" w:type="dxa"/>
+              <w:end w:w="120" w:type="dxa"/>
+            </w:tcMar>
+          </w:tcPr>
+          <w:p>
+            <w:pPr>
+              <w:spacing w:after="0"/>
+              <w:jc w:val="left"/>
+            </w:pPr>
+            <w:r>
+              <w:rPr>
+                <w:sz w:val="15"/>
+              </w:rPr>
+              <w:t>Probability scale</w:t>
+            </w:r>
+          </w:p>
+        </w:tc>
+        <w:tc>
+          <w:tcPr>
+            <w:tcW w:type="dxa" w:w="2592"/>
+            <w:vAlign w:val="center"/>
+            <w:tcMar>
+              <w:top w:w="100" w:type="dxa"/>
+              <w:start w:w="120" w:type="dxa"/>
+              <w:bottom w:w="100" w:type="dxa"/>
+              <w:end w:w="120" w:type="dxa"/>
+            </w:tcMar>
+          </w:tcPr>
+          <w:p>
+            <w:pPr>
+              <w:spacing w:after="0"/>
+              <w:jc w:val="center"/>
+            </w:pPr>
+            <w:r>
+              <w:rPr>
+                <w:sz w:val="15"/>
+              </w:rPr>
+              <w:t>400 cp per probability unit</w:t>
+            </w:r>
+          </w:p>
+        </w:tc>
+        <w:tc>
+          <w:tcPr>
+            <w:tcW w:type="dxa" w:w="4896"/>
+            <w:vAlign w:val="center"/>
+            <w:tcMar>
+              <w:top w:w="100" w:type="dxa"/>
+              <w:start w:w="120" w:type="dxa"/>
+              <w:bottom w:w="100" w:type="dxa"/>
+              <w:end w:w="120" w:type="dxa"/>
+            </w:tcMar>
+          </w:tcPr>
+          <w:p>
+            <w:pPr>
+              <w:spacing w:after="0"/>
+              <w:jc w:val="center"/>
+            </w:pPr>
+            <w:r>
+              <w:rPr>
+                <w:sz w:val="15"/>
+              </w:rPr>
+              <w:t>Part of the closest policy to the 10-25% intervention target</w:t>
+            </w:r>
+          </w:p>
+        </w:tc>
+      </w:tr>
+      <w:tr>
+        <w:trPr>
+          <w:cantSplit/>
+        </w:trPr>
+        <w:tc>
+          <w:tcPr>
+            <w:tcW w:type="dxa" w:w="2592"/>
+            <w:vAlign w:val="center"/>
+            <w:tcMar>
+              <w:top w:w="100" w:type="dxa"/>
+              <w:start w:w="120" w:type="dxa"/>
+              <w:bottom w:w="100" w:type="dxa"/>
+              <w:end w:w="120" w:type="dxa"/>
+            </w:tcMar>
+            <w:shd w:fill="F3F7FB"/>
+          </w:tcPr>
+          <w:p>
+            <w:pPr>
+              <w:spacing w:after="0"/>
+              <w:jc w:val="left"/>
+            </w:pPr>
+            <w:r>
+              <w:rPr>
+                <w:sz w:val="15"/>
+              </w:rPr>
+              <w:t>Maximum learned bonus</w:t>
+            </w:r>
+          </w:p>
+        </w:tc>
+        <w:tc>
+          <w:tcPr>
+            <w:tcW w:type="dxa" w:w="2592"/>
+            <w:vAlign w:val="center"/>
+            <w:tcMar>
+              <w:top w:w="100" w:type="dxa"/>
+              <w:start w:w="120" w:type="dxa"/>
+              <w:bottom w:w="100" w:type="dxa"/>
+              <w:end w:w="120" w:type="dxa"/>
+            </w:tcMar>
+            <w:shd w:fill="F3F7FB"/>
+          </w:tcPr>
+          <w:p>
+            <w:pPr>
+              <w:spacing w:after="0"/>
+              <w:jc w:val="center"/>
+            </w:pPr>
+            <w:r>
+              <w:rPr>
+                <w:sz w:val="15"/>
+              </w:rPr>
+              <w:t>35 cp</w:t>
+            </w:r>
+          </w:p>
+        </w:tc>
+        <w:tc>
+          <w:tcPr>
+            <w:tcW w:type="dxa" w:w="4896"/>
+            <w:vAlign w:val="center"/>
+            <w:tcMar>
+              <w:top w:w="100" w:type="dxa"/>
+              <w:start w:w="120" w:type="dxa"/>
+              <w:bottom w:w="100" w:type="dxa"/>
+              <w:end w:w="120" w:type="dxa"/>
+            </w:tcMar>
+            <w:shd w:fill="F3F7FB"/>
+          </w:tcPr>
+          <w:p>
+            <w:pPr>
+              <w:spacing w:after="0"/>
+              <w:jc w:val="center"/>
+            </w:pPr>
+            <w:r>
+              <w:rPr>
+                <w:sz w:val="15"/>
+              </w:rPr>
+              <w:t>Still subordinate to the 35 cp objective eligibility bound</w:t>
+            </w:r>
+          </w:p>
+        </w:tc>
+      </w:tr>
+      <w:tr>
+        <w:trPr>
+          <w:cantSplit/>
+        </w:trPr>
+        <w:tc>
+          <w:tcPr>
+            <w:tcW w:type="dxa" w:w="2592"/>
+            <w:vAlign w:val="center"/>
+            <w:tcMar>
+              <w:top w:w="100" w:type="dxa"/>
+              <w:start w:w="120" w:type="dxa"/>
+              <w:bottom w:w="100" w:type="dxa"/>
+              <w:end w:w="120" w:type="dxa"/>
+            </w:tcMar>
+          </w:tcPr>
+          <w:p>
+            <w:pPr>
+              <w:spacing w:after="0"/>
+              <w:jc w:val="left"/>
+            </w:pPr>
+            <w:r>
+              <w:rPr>
+                <w:sz w:val="15"/>
+              </w:rPr>
+              <w:t>Candidate count</w:t>
+            </w:r>
+          </w:p>
+        </w:tc>
+        <w:tc>
+          <w:tcPr>
+            <w:tcW w:type="dxa" w:w="2592"/>
+            <w:vAlign w:val="center"/>
+            <w:tcMar>
+              <w:top w:w="100" w:type="dxa"/>
+              <w:start w:w="120" w:type="dxa"/>
+              <w:bottom w:w="100" w:type="dxa"/>
+              <w:end w:w="120" w:type="dxa"/>
+            </w:tcMar>
+          </w:tcPr>
+          <w:p>
+            <w:pPr>
+              <w:spacing w:after="0"/>
+              <w:jc w:val="center"/>
+            </w:pPr>
+            <w:r>
+              <w:rPr>
+                <w:sz w:val="15"/>
+              </w:rPr>
+              <w:t>MultiPV 8</w:t>
+            </w:r>
+          </w:p>
+        </w:tc>
+        <w:tc>
+          <w:tcPr>
+            <w:tcW w:type="dxa" w:w="4896"/>
+            <w:vAlign w:val="center"/>
+            <w:tcMar>
+              <w:top w:w="100" w:type="dxa"/>
+              <w:start w:w="120" w:type="dxa"/>
+              <w:bottom w:w="100" w:type="dxa"/>
+              <w:end w:w="120" w:type="dxa"/>
+            </w:tcMar>
+          </w:tcPr>
+          <w:p>
+            <w:pPr>
+              <w:spacing w:after="0"/>
+              <w:jc w:val="center"/>
+            </w:pPr>
+            <w:r>
+              <w:rPr>
+                <w:sz w:val="15"/>
+              </w:rPr>
+              <w:t>Same all-root search; retains eight completed candidates</w:t>
+            </w:r>
+          </w:p>
+        </w:tc>
+      </w:tr>
+      <w:tr>
+        <w:trPr>
+          <w:cantSplit/>
+        </w:trPr>
+        <w:tc>
+          <w:tcPr>
+            <w:tcW w:type="dxa" w:w="2592"/>
+            <w:vAlign w:val="center"/>
+            <w:tcMar>
+              <w:top w:w="100" w:type="dxa"/>
+              <w:start w:w="120" w:type="dxa"/>
+              <w:bottom w:w="100" w:type="dxa"/>
+              <w:end w:w="120" w:type="dxa"/>
+            </w:tcMar>
+            <w:shd w:fill="F3F7FB"/>
+          </w:tcPr>
+          <w:p>
+            <w:pPr>
+              <w:spacing w:after="0"/>
+              <w:jc w:val="left"/>
+            </w:pPr>
+            <w:r>
+              <w:rPr>
+                <w:sz w:val="15"/>
+              </w:rPr>
+              <w:t>Observed intervention</w:t>
+            </w:r>
+          </w:p>
+        </w:tc>
+        <w:tc>
+          <w:tcPr>
+            <w:tcW w:type="dxa" w:w="2592"/>
+            <w:vAlign w:val="center"/>
+            <w:tcMar>
+              <w:top w:w="100" w:type="dxa"/>
+              <w:start w:w="120" w:type="dxa"/>
+              <w:bottom w:w="100" w:type="dxa"/>
+              <w:end w:w="120" w:type="dxa"/>
+            </w:tcMar>
+            <w:shd w:fill="F3F7FB"/>
+          </w:tcPr>
+          <w:p>
+            <w:pPr>
+              <w:spacing w:after="0"/>
+              <w:jc w:val="center"/>
+            </w:pPr>
+            <w:r>
+              <w:rPr>
+                <w:sz w:val="15"/>
+              </w:rPr>
+              <w:t>23 of 231 (9.96%)</w:t>
+            </w:r>
+          </w:p>
+        </w:tc>
+        <w:tc>
+          <w:tcPr>
+            <w:tcW w:type="dxa" w:w="4896"/>
+            <w:vAlign w:val="center"/>
+            <w:tcMar>
+              <w:top w:w="100" w:type="dxa"/>
+              <w:start w:w="120" w:type="dxa"/>
+              <w:bottom w:w="100" w:type="dxa"/>
+              <w:end w:w="120" w:type="dxa"/>
+            </w:tcMar>
+            <w:shd w:fill="F3F7FB"/>
+          </w:tcPr>
+          <w:p>
+            <w:pPr>
+              <w:spacing w:after="0"/>
+              <w:jc w:val="center"/>
+            </w:pPr>
+            <w:r>
+              <w:rPr>
+                <w:sz w:val="15"/>
+              </w:rPr>
+              <w:t>Mean predicted lift 5.01 percentage points when changed</w:t>
+            </w:r>
+          </w:p>
+        </w:tc>
+      </w:tr>
+      <w:tr>
+        <w:trPr>
+          <w:cantSplit/>
+        </w:trPr>
+        <w:tc>
+          <w:tcPr>
+            <w:tcW w:type="dxa" w:w="2592"/>
+            <w:vAlign w:val="center"/>
+            <w:tcMar>
+              <w:top w:w="100" w:type="dxa"/>
+              <w:start w:w="120" w:type="dxa"/>
+              <w:bottom w:w="100" w:type="dxa"/>
+              <w:end w:w="120" w:type="dxa"/>
+            </w:tcMar>
+          </w:tcPr>
+          <w:p>
+            <w:pPr>
+              <w:spacing w:after="0"/>
+              <w:jc w:val="left"/>
+            </w:pPr>
+            <w:r>
+              <w:rPr>
+                <w:sz w:val="15"/>
+              </w:rPr>
+              <w:t>Objective cost</w:t>
+            </w:r>
+          </w:p>
+        </w:tc>
+        <w:tc>
+          <w:tcPr>
+            <w:tcW w:type="dxa" w:w="2592"/>
+            <w:vAlign w:val="center"/>
+            <w:tcMar>
+              <w:top w:w="100" w:type="dxa"/>
+              <w:start w:w="120" w:type="dxa"/>
+              <w:bottom w:w="100" w:type="dxa"/>
+              <w:end w:w="120" w:type="dxa"/>
+            </w:tcMar>
+          </w:tcPr>
+          <w:p>
+            <w:pPr>
+              <w:spacing w:after="0"/>
+              <w:jc w:val="center"/>
+            </w:pPr>
+            <w:r>
+              <w:rPr>
+                <w:sz w:val="15"/>
+              </w:rPr>
+              <w:t>0.68 cp mean; 33 cp maximum</w:t>
+            </w:r>
+          </w:p>
+        </w:tc>
+        <w:tc>
+          <w:tcPr>
+            <w:tcW w:type="dxa" w:w="4896"/>
+            <w:vAlign w:val="center"/>
+            <w:tcMar>
+              <w:top w:w="100" w:type="dxa"/>
+              <w:start w:w="120" w:type="dxa"/>
+              <w:bottom w:w="100" w:type="dxa"/>
+              <w:end w:w="120" w:type="dxa"/>
+            </w:tcMar>
+          </w:tcPr>
+          <w:p>
+            <w:pPr>
+              <w:spacing w:after="0"/>
+              <w:jc w:val="center"/>
+            </w:pPr>
+            <w:r>
+              <w:rPr>
+                <w:sz w:val="15"/>
+              </w:rPr>
+              <w:t>Measured over all validation positions</w:t>
+            </w:r>
+          </w:p>
+        </w:tc>
+      </w:tr>
+    </w:tbl>
+    <w:p>
+      <w:pPr>
+        <w:spacing w:after="20"/>
+      </w:pPr>
+    </w:p>
+    <w:p>
+      <w:r>
+        <w:t>The original 100 cp scale changed only 2.60% of validation moves. No grid point quite reached 10%, so the written fallback selected the configuration closest to the midpoint of the intended intervention range. The scale was changed to increase experimental power, not because it improved game outcomes; no human or final-test result entered selection.</w:t>
+      </w:r>
+    </w:p>
+    <w:p>
+      <w:r>
+        <w:t>Population and personal probabilities correlated at 0.794, yet their highest-risk candidate differed in 64.1% of positions. Only 0.43% of candidate rows exceeded any historical train-plus-validation feature range. On a separate 64-position replay, the final personal policy changed 5 moves, averaged 0.27 cp loss, lost at most 10 cp, and had zero candidate mismatches across arms.</w:t>
+      </w:r>
+    </w:p>
+    <w:tbl>
+      <w:tblPr>
+        <w:tblStyle w:val="TableGrid"/>
+        <w:tblW w:type="auto" w:w="0"/>
+        <w:jc w:val="center"/>
+        <w:tblLayout w:type="fixed"/>
+        <w:tblLook w:firstColumn="1" w:firstRow="1" w:lastColumn="0" w:lastRow="0" w:noHBand="0" w:noVBand="1" w:val="04A0"/>
+      </w:tblPr>
+      <w:tblGrid>
+        <w:gridCol w:w="2469"/>
+        <w:gridCol w:w="2469"/>
+        <w:gridCol w:w="2469"/>
+        <w:gridCol w:w="2469"/>
+      </w:tblGrid>
+      <w:tr>
+        <w:trPr>
+          <w:tblHeader w:val="true"/>
+          <w:cantSplit/>
+        </w:trPr>
+        <w:tc>
+          <w:tcPr>
+            <w:tcW w:type="dxa" w:w="2088"/>
+            <w:shd w:fill="17365D"/>
+            <w:vAlign w:val="center"/>
+            <w:tcMar>
+              <w:top w:w="100" w:type="dxa"/>
+              <w:start w:w="120" w:type="dxa"/>
+              <w:bottom w:w="100" w:type="dxa"/>
+              <w:end w:w="120" w:type="dxa"/>
+            </w:tcMar>
+          </w:tcPr>
+          <w:p>
+            <w:pPr>
+              <w:keepNext/>
+              <w:jc w:val="center"/>
+            </w:pPr>
+            <w:r>
+              <w:rPr>
+                <w:b/>
+                <w:color w:val="FFFFFF"/>
+                <w:sz w:val="15"/>
+              </w:rPr>
+              <w:t>Final-policy safety arm</w:t>
+            </w:r>
+          </w:p>
+        </w:tc>
+        <w:tc>
+          <w:tcPr>
+            <w:tcW w:type="dxa" w:w="1440"/>
+            <w:shd w:fill="17365D"/>
+            <w:vAlign w:val="center"/>
+            <w:tcMar>
+              <w:top w:w="100" w:type="dxa"/>
+              <w:start w:w="120" w:type="dxa"/>
+              <w:bottom w:w="100" w:type="dxa"/>
+              <w:end w:w="120" w:type="dxa"/>
+            </w:tcMar>
+          </w:tcPr>
+          <w:p>
+            <w:pPr>
+              <w:keepNext/>
+              <w:jc w:val="center"/>
+            </w:pPr>
+            <w:r>
+              <w:rPr>
+                <w:b/>
+                <w:color w:val="FFFFFF"/>
+                <w:sz w:val="15"/>
+              </w:rPr>
+              <w:t>W-D-L</w:t>
+            </w:r>
+          </w:p>
+        </w:tc>
+        <w:tc>
+          <w:tcPr>
+            <w:tcW w:type="dxa" w:w="1440"/>
+            <w:shd w:fill="17365D"/>
+            <w:vAlign w:val="center"/>
+            <w:tcMar>
+              <w:top w:w="100" w:type="dxa"/>
+              <w:start w:w="120" w:type="dxa"/>
+              <w:bottom w:w="100" w:type="dxa"/>
+              <w:end w:w="120" w:type="dxa"/>
+            </w:tcMar>
+          </w:tcPr>
+          <w:p>
+            <w:pPr>
+              <w:keepNext/>
+              <w:jc w:val="center"/>
+            </w:pPr>
+            <w:r>
+              <w:rPr>
+                <w:b/>
+                <w:color w:val="FFFFFF"/>
+                <w:sz w:val="15"/>
+              </w:rPr>
+              <w:t>Score</w:t>
+            </w:r>
+          </w:p>
+        </w:tc>
+        <w:tc>
+          <w:tcPr>
+            <w:tcW w:type="dxa" w:w="5112"/>
+            <w:shd w:fill="17365D"/>
+            <w:vAlign w:val="center"/>
+            <w:tcMar>
+              <w:top w:w="100" w:type="dxa"/>
+              <w:start w:w="120" w:type="dxa"/>
+              <w:bottom w:w="100" w:type="dxa"/>
+              <w:end w:w="120" w:type="dxa"/>
+            </w:tcMar>
+          </w:tcPr>
+          <w:p>
+            <w:pPr>
+              <w:keepNext/>
+              <w:jc w:val="center"/>
+            </w:pPr>
+            <w:r>
+              <w:rPr>
+                <w:b/>
+                <w:color w:val="FFFFFF"/>
+                <w:sz w:val="15"/>
+              </w:rPr>
+              <w:t>Difference from neutral (95% interval)</w:t>
+            </w:r>
+          </w:p>
+        </w:tc>
+      </w:tr>
+      <w:tr>
+        <w:trPr>
+          <w:cantSplit/>
+        </w:trPr>
+        <w:tc>
+          <w:tcPr>
+            <w:tcW w:type="dxa" w:w="2088"/>
+            <w:vAlign w:val="center"/>
+            <w:tcMar>
+              <w:top w:w="100" w:type="dxa"/>
+              <w:start w:w="120" w:type="dxa"/>
+              <w:bottom w:w="100" w:type="dxa"/>
+              <w:end w:w="120" w:type="dxa"/>
+            </w:tcMar>
+          </w:tcPr>
+          <w:p>
+            <w:pPr>
+              <w:spacing w:after="0"/>
+              <w:jc w:val="left"/>
+            </w:pPr>
+            <w:r>
+              <w:rPr>
+                <w:sz w:val="15"/>
+              </w:rPr>
+              <w:t>Neutral</w:t>
+            </w:r>
+          </w:p>
+        </w:tc>
+        <w:tc>
+          <w:tcPr>
+            <w:tcW w:type="dxa" w:w="1440"/>
+            <w:vAlign w:val="center"/>
+            <w:tcMar>
+              <w:top w:w="100" w:type="dxa"/>
+              <w:start w:w="120" w:type="dxa"/>
+              <w:bottom w:w="100" w:type="dxa"/>
+              <w:end w:w="120" w:type="dxa"/>
+            </w:tcMar>
+          </w:tcPr>
+          <w:p>
+            <w:pPr>
+              <w:spacing w:after="0"/>
+              <w:jc w:val="center"/>
+            </w:pPr>
+            <w:r>
+              <w:rPr>
+                <w:sz w:val="15"/>
+              </w:rPr>
+              <w:t>12-3-1</w:t>
+            </w:r>
+          </w:p>
+        </w:tc>
+        <w:tc>
+          <w:tcPr>
+            <w:tcW w:type="dxa" w:w="1440"/>
+            <w:vAlign w:val="center"/>
+            <w:tcMar>
+              <w:top w:w="100" w:type="dxa"/>
+              <w:start w:w="120" w:type="dxa"/>
+              <w:bottom w:w="100" w:type="dxa"/>
+              <w:end w:w="120" w:type="dxa"/>
+            </w:tcMar>
+          </w:tcPr>
+          <w:p>
+            <w:pPr>
+              <w:spacing w:after="0"/>
+              <w:jc w:val="center"/>
+            </w:pPr>
+            <w:r>
+              <w:rPr>
+                <w:sz w:val="15"/>
+              </w:rPr>
+              <w:t>84.38%</w:t>
+            </w:r>
+          </w:p>
+        </w:tc>
+        <w:tc>
+          <w:tcPr>
+            <w:tcW w:type="dxa" w:w="5112"/>
+            <w:vAlign w:val="center"/>
+            <w:tcMar>
+              <w:top w:w="100" w:type="dxa"/>
+              <w:start w:w="120" w:type="dxa"/>
+              <w:bottom w:w="100" w:type="dxa"/>
+              <w:end w:w="120" w:type="dxa"/>
+            </w:tcMar>
+          </w:tcPr>
+          <w:p>
+            <w:pPr>
+              <w:spacing w:after="0"/>
+              <w:jc w:val="center"/>
+            </w:pPr>
+            <w:r>
+              <w:rPr>
+                <w:sz w:val="15"/>
+              </w:rPr>
+              <w:t>reference</w:t>
+            </w:r>
+          </w:p>
+        </w:tc>
+      </w:tr>
+      <w:tr>
+        <w:trPr>
+          <w:cantSplit/>
+        </w:trPr>
+        <w:tc>
+          <w:tcPr>
+            <w:tcW w:type="dxa" w:w="2088"/>
+            <w:vAlign w:val="center"/>
+            <w:tcMar>
+              <w:top w:w="100" w:type="dxa"/>
+              <w:start w:w="120" w:type="dxa"/>
+              <w:bottom w:w="100" w:type="dxa"/>
+              <w:end w:w="120" w:type="dxa"/>
+            </w:tcMar>
+            <w:shd w:fill="F3F7FB"/>
+          </w:tcPr>
+          <w:p>
+            <w:pPr>
+              <w:spacing w:after="0"/>
+              <w:jc w:val="left"/>
+            </w:pPr>
+            <w:r>
+              <w:rPr>
+                <w:sz w:val="15"/>
+              </w:rPr>
+              <w:t>Population</w:t>
+            </w:r>
+          </w:p>
+        </w:tc>
+        <w:tc>
+          <w:tcPr>
+            <w:tcW w:type="dxa" w:w="1440"/>
+            <w:vAlign w:val="center"/>
+            <w:tcMar>
+              <w:top w:w="100" w:type="dxa"/>
+              <w:start w:w="120" w:type="dxa"/>
+              <w:bottom w:w="100" w:type="dxa"/>
+              <w:end w:w="120" w:type="dxa"/>
+            </w:tcMar>
+            <w:shd w:fill="F3F7FB"/>
+          </w:tcPr>
+          <w:p>
+            <w:pPr>
+              <w:spacing w:after="0"/>
+              <w:jc w:val="center"/>
+            </w:pPr>
+            <w:r>
+              <w:rPr>
+                <w:sz w:val="15"/>
+              </w:rPr>
+              <w:t>12-3-1</w:t>
+            </w:r>
+          </w:p>
+        </w:tc>
+        <w:tc>
+          <w:tcPr>
+            <w:tcW w:type="dxa" w:w="1440"/>
+            <w:vAlign w:val="center"/>
+            <w:tcMar>
+              <w:top w:w="100" w:type="dxa"/>
+              <w:start w:w="120" w:type="dxa"/>
+              <w:bottom w:w="100" w:type="dxa"/>
+              <w:end w:w="120" w:type="dxa"/>
+            </w:tcMar>
+            <w:shd w:fill="F3F7FB"/>
+          </w:tcPr>
+          <w:p>
+            <w:pPr>
+              <w:spacing w:after="0"/>
+              <w:jc w:val="center"/>
+            </w:pPr>
+            <w:r>
+              <w:rPr>
+                <w:sz w:val="15"/>
+              </w:rPr>
+              <w:t>84.38%</w:t>
+            </w:r>
+          </w:p>
+        </w:tc>
+        <w:tc>
+          <w:tcPr>
+            <w:tcW w:type="dxa" w:w="5112"/>
+            <w:vAlign w:val="center"/>
+            <w:tcMar>
+              <w:top w:w="100" w:type="dxa"/>
+              <w:start w:w="120" w:type="dxa"/>
+              <w:bottom w:w="100" w:type="dxa"/>
+              <w:end w:w="120" w:type="dxa"/>
+            </w:tcMar>
+            <w:shd w:fill="F3F7FB"/>
+          </w:tcPr>
+          <w:p>
+            <w:pPr>
+              <w:spacing w:after="0"/>
+              <w:jc w:val="center"/>
+            </w:pPr>
+            <w:r>
+              <w:rPr>
+                <w:sz w:val="15"/>
+              </w:rPr>
+              <w:t>0.00 pp (-18.75, +18.75)</w:t>
+            </w:r>
+          </w:p>
+        </w:tc>
+      </w:tr>
+      <w:tr>
+        <w:trPr>
+          <w:cantSplit/>
+        </w:trPr>
+        <w:tc>
+          <w:tcPr>
+            <w:tcW w:type="dxa" w:w="2088"/>
+            <w:vAlign w:val="center"/>
+            <w:tcMar>
+              <w:top w:w="100" w:type="dxa"/>
+              <w:start w:w="120" w:type="dxa"/>
+              <w:bottom w:w="100" w:type="dxa"/>
+              <w:end w:w="120" w:type="dxa"/>
+            </w:tcMar>
+          </w:tcPr>
+          <w:p>
+            <w:pPr>
+              <w:spacing w:after="0"/>
+              <w:jc w:val="left"/>
+            </w:pPr>
+            <w:r>
+              <w:rPr>
+                <w:sz w:val="15"/>
+              </w:rPr>
+              <w:t>Personal</w:t>
+            </w:r>
+          </w:p>
+        </w:tc>
+        <w:tc>
+          <w:tcPr>
+            <w:tcW w:type="dxa" w:w="1440"/>
+            <w:vAlign w:val="center"/>
+            <w:tcMar>
+              <w:top w:w="100" w:type="dxa"/>
+              <w:start w:w="120" w:type="dxa"/>
+              <w:bottom w:w="100" w:type="dxa"/>
+              <w:end w:w="120" w:type="dxa"/>
+            </w:tcMar>
+          </w:tcPr>
+          <w:p>
+            <w:pPr>
+              <w:spacing w:after="0"/>
+              <w:jc w:val="center"/>
+            </w:pPr>
+            <w:r>
+              <w:rPr>
+                <w:sz w:val="15"/>
+              </w:rPr>
+              <w:t>12-4-0</w:t>
+            </w:r>
+          </w:p>
+        </w:tc>
+        <w:tc>
+          <w:tcPr>
+            <w:tcW w:type="dxa" w:w="1440"/>
+            <w:vAlign w:val="center"/>
+            <w:tcMar>
+              <w:top w:w="100" w:type="dxa"/>
+              <w:start w:w="120" w:type="dxa"/>
+              <w:bottom w:w="100" w:type="dxa"/>
+              <w:end w:w="120" w:type="dxa"/>
+            </w:tcMar>
+          </w:tcPr>
+          <w:p>
+            <w:pPr>
+              <w:spacing w:after="0"/>
+              <w:jc w:val="center"/>
+            </w:pPr>
+            <w:r>
+              <w:rPr>
+                <w:sz w:val="15"/>
+              </w:rPr>
+              <w:t>87.50%</w:t>
+            </w:r>
+          </w:p>
+        </w:tc>
+        <w:tc>
+          <w:tcPr>
+            <w:tcW w:type="dxa" w:w="5112"/>
+            <w:vAlign w:val="center"/>
+            <w:tcMar>
+              <w:top w:w="100" w:type="dxa"/>
+              <w:start w:w="120" w:type="dxa"/>
+              <w:bottom w:w="100" w:type="dxa"/>
+              <w:end w:w="120" w:type="dxa"/>
+            </w:tcMar>
+          </w:tcPr>
+          <w:p>
+            <w:pPr>
+              <w:spacing w:after="0"/>
+              <w:jc w:val="center"/>
+            </w:pPr>
+            <w:r>
+              <w:rPr>
+                <w:sz w:val="15"/>
+              </w:rPr>
+              <w:t>+3.13 pp (-15.63, +25.00)</w:t>
+            </w:r>
+          </w:p>
+        </w:tc>
+      </w:tr>
+      <w:tr>
+        <w:trPr>
+          <w:cantSplit/>
+        </w:trPr>
+        <w:tc>
+          <w:tcPr>
+            <w:tcW w:type="dxa" w:w="2088"/>
+            <w:vAlign w:val="center"/>
+            <w:tcMar>
+              <w:top w:w="100" w:type="dxa"/>
+              <w:start w:w="120" w:type="dxa"/>
+              <w:bottom w:w="100" w:type="dxa"/>
+              <w:end w:w="120" w:type="dxa"/>
+            </w:tcMar>
+            <w:shd w:fill="F3F7FB"/>
+          </w:tcPr>
+          <w:p>
+            <w:pPr>
+              <w:spacing w:after="0"/>
+              <w:jc w:val="left"/>
+            </w:pPr>
+            <w:r>
+              <w:rPr>
+                <w:sz w:val="15"/>
+              </w:rPr>
+              <w:t>Random-safe</w:t>
+            </w:r>
+          </w:p>
+        </w:tc>
+        <w:tc>
+          <w:tcPr>
+            <w:tcW w:type="dxa" w:w="1440"/>
+            <w:vAlign w:val="center"/>
+            <w:tcMar>
+              <w:top w:w="100" w:type="dxa"/>
+              <w:start w:w="120" w:type="dxa"/>
+              <w:bottom w:w="100" w:type="dxa"/>
+              <w:end w:w="120" w:type="dxa"/>
+            </w:tcMar>
+            <w:shd w:fill="F3F7FB"/>
+          </w:tcPr>
+          <w:p>
+            <w:pPr>
+              <w:spacing w:after="0"/>
+              <w:jc w:val="center"/>
+            </w:pPr>
+            <w:r>
+              <w:rPr>
+                <w:sz w:val="15"/>
+              </w:rPr>
+              <w:t>10-3-3</w:t>
+            </w:r>
+          </w:p>
+        </w:tc>
+        <w:tc>
+          <w:tcPr>
+            <w:tcW w:type="dxa" w:w="1440"/>
+            <w:vAlign w:val="center"/>
+            <w:tcMar>
+              <w:top w:w="100" w:type="dxa"/>
+              <w:start w:w="120" w:type="dxa"/>
+              <w:bottom w:w="100" w:type="dxa"/>
+              <w:end w:w="120" w:type="dxa"/>
+            </w:tcMar>
+            <w:shd w:fill="F3F7FB"/>
+          </w:tcPr>
+          <w:p>
+            <w:pPr>
+              <w:spacing w:after="0"/>
+              <w:jc w:val="center"/>
+            </w:pPr>
+            <w:r>
+              <w:rPr>
+                <w:sz w:val="15"/>
+              </w:rPr>
+              <w:t>71.88%</w:t>
+            </w:r>
+          </w:p>
+        </w:tc>
+        <w:tc>
+          <w:tcPr>
+            <w:tcW w:type="dxa" w:w="5112"/>
+            <w:vAlign w:val="center"/>
+            <w:tcMar>
+              <w:top w:w="100" w:type="dxa"/>
+              <w:start w:w="120" w:type="dxa"/>
+              <w:bottom w:w="100" w:type="dxa"/>
+              <w:end w:w="120" w:type="dxa"/>
+            </w:tcMar>
+            <w:shd w:fill="F3F7FB"/>
+          </w:tcPr>
+          <w:p>
+            <w:pPr>
+              <w:spacing w:after="0"/>
+              <w:jc w:val="center"/>
+            </w:pPr>
+            <w:r>
+              <w:rPr>
+                <w:sz w:val="15"/>
+              </w:rPr>
+              <w:t>-12.50 pp (-37.50, +12.50)</w:t>
+            </w:r>
+          </w:p>
+        </w:tc>
+      </w:tr>
+    </w:tbl>
+    <w:p>
+      <w:pPr>
+        <w:spacing w:after="20"/>
+      </w:pPr>
+    </w:p>
+    <w:p>
+      <w:r>
+        <w:t>The updated safety match remains inconclusive: every interval includes zero. The random arm's lower point estimate warns that arbitrary reranking can be harmful, but the sample is too small to establish that effect.</w:t>
+      </w:r>
+    </w:p>
+    <w:p>
+      <w:pPr>
+        <w:pStyle w:val="Heading3"/>
+      </w:pPr>
+      <w:r>
+        <w:t>10.4 Prospective human experiment freeze</w:t>
+      </w:r>
+    </w:p>
+    <w:p>
+      <w:r>
+        <w:t>Neutral MultiPV 8 was calibrated against Stockfish limited to 1164. It scored 25.0% at 2,000 nodes, 50.0% in an initial 5,000-node sample, and 62.5% in a 32-game 5,000-node confirmation. The combined 5,000-node score was 58.3%, approximately 1223 on this local protocol. Five thousand nodes was therefore chosen to avoid a nearly one-sided human match; it is not claimed as a Chess.com rating equivalence.</w:t>
+      </w:r>
+    </w:p>
+    <w:p>
+      <w:r>
+        <w:t>A private balanced schedule now has a public SHA-256 commitment. One excluded eight-game pilot is followed by twenty eight-game confirmatory blocks, for 160 confirmatory games. Every block uses one opening and includes all four arms once with Yash as White and once as Black. A UCI proxy forces MultiPV 8 and 5,000 nodes, prevents GUI option overrides, and suppresses profile-identifying output.</w:t>
+      </w:r>
+    </w:p>
+    <w:p>
+      <w:r>
+        <w:t>The primary endpoint is engine game score for personal minus neutral, analyzed by blocked bootstrap and exact blocked randomization. Population and random contrasts, centipawn loss, error thresholds, and calibration are secondary. There is no efficacy stopping and no policy update during the study.</w:t>
+      </w:r>
+    </w:p>
+    <w:p>
+      <w:pPr>
         <w:pStyle w:val="Heading2"/>
       </w:pPr>
       <w:r>
@@ -9449,7 +10543,7 @@
               <w:rPr>
                 <w:sz w:val="17"/>
               </w:rPr>
-              <w:t>Frozen C++ learned selection is parity-tested, bounded, and conservative</w:t>
+              <w:t>Frozen C++ learned selection is parity-tested, bounded, and validation-selected</w:t>
             </w:r>
           </w:p>
         </w:tc>
@@ -9473,7 +10567,7 @@
               <w:rPr>
                 <w:sz w:val="17"/>
               </w:rPr>
-              <w:t>Online refresh improves real match outcomes</w:t>
+              <w:t>Personalized selection improves prospective human match score</w:t>
             </w:r>
           </w:p>
         </w:tc>
@@ -9494,7 +10588,7 @@
     </w:p>
     <w:p>
       <w:r>
-        <w:t>The probability model and playing policy are now frozen and parity-tested. The remaining confirmatory phase must measure their effect against the profiled human without tuning on that final match set.</w:t>
+        <w:t>The probability model, playing policy, node budget, schedule commitment, and analysis plan are now frozen. The remaining confirmatory phase must collect prospective human games without tuning on their outcomes.</w:t>
       </w:r>
     </w:p>
     <w:p>
@@ -9508,7 +10602,7 @@
         <w:t xml:space="preserve">1. </w:t>
       </w:r>
       <w:r>
-        <w:t>Preregister the prospective match sample size, stopping rule, random arm order, color balance, opening policy, time control, and primary score comparison.</w:t>
+        <w:t>Complete the excluded eight-game pilot and verify GUI operation, schedule logging, colors, openings, legal play, and continued blinding.</w:t>
       </w:r>
     </w:p>
     <w:p>
@@ -9522,7 +10616,7 @@
         <w:t xml:space="preserve">2. </w:t>
       </w:r>
       <w:r>
-        <w:t>Run blinded games in which Yash faces neutral, population, personal, and random-safe arms without knowing the active policy. Preserve identical MultiPV 4 node limits and hardware.</w:t>
+        <w:t>If the pilot requires no protocol change, begin the 160-game confirmatory schedule. If it reveals a defect, issue a new schedule commitment and restart confirmation after the fix.</w:t>
       </w:r>
     </w:p>
     <w:p>
@@ -9536,7 +10630,7 @@
         <w:t xml:space="preserve">3. </w:t>
       </w:r>
       <w:r>
-        <w:t>Use paired game-level uncertainty or SPRT and report all arms. Do not tune the 100 cp probability scale or 20 cp cap on these games.</w:t>
+        <w:t>Label completed decisions with the already fixed 100,000-node reference process while keeping those results unavailable for policy tuning.</w:t>
       </w:r>
     </w:p>
     <w:p>
@@ -9550,7 +10644,7 @@
         <w:t xml:space="preserve">4. </w:t>
       </w:r>
       <w:r>
-        <w:t>Treat the human result as the causal endpoint. Retrospective prediction and Stockfish safety matches cannot substitute for it.</w:t>
+        <w:t>After all confirmatory games, unblind once, verify the private-schedule hash, and run the preregistered blocked game-level and decision-level analyses.</w:t>
       </w:r>
     </w:p>
     <w:p>
@@ -9564,7 +10658,7 @@
         <w:t xml:space="preserve">5. </w:t>
       </w:r>
       <w:r>
-        <w:t>Only after the frozen causal match, evaluate a deployment process that periodically relabels completed games and refreshes the lifetime model in preregistered 20-game batches.</w:t>
+        <w:t>Only after the frozen causal analysis, evaluate 20-game online model refreshes as a new, separately versioned experiment.</w:t>
       </w:r>
     </w:p>
     <w:p>
@@ -10381,6 +11475,86 @@
                 <w:sz w:val="16"/>
               </w:rPr>
               <w:t>Inference and feature parity, 32-position identical-candidate replay, and 64-game safety match</w:t>
+            </w:r>
+          </w:p>
+        </w:tc>
+      </w:tr>
+      <w:tr>
+        <w:trPr>
+          <w:cantSplit/>
+        </w:trPr>
+        <w:tc>
+          <w:tcPr>
+            <w:tcW w:type="dxa" w:w="1800"/>
+            <w:vAlign w:val="center"/>
+            <w:tcMar>
+              <w:top w:w="100" w:type="dxa"/>
+              <w:start w:w="120" w:type="dxa"/>
+              <w:bottom w:w="100" w:type="dxa"/>
+              <w:end w:w="120" w:type="dxa"/>
+            </w:tcMar>
+            <w:shd w:fill="F3F7FB"/>
+          </w:tcPr>
+          <w:p>
+            <w:pPr>
+              <w:spacing w:after="0"/>
+              <w:jc w:val="left"/>
+            </w:pPr>
+            <w:r>
+              <w:rPr>
+                <w:sz w:val="16"/>
+              </w:rPr>
+              <w:t>1 Oct 2026</w:t>
+            </w:r>
+          </w:p>
+        </w:tc>
+        <w:tc>
+          <w:tcPr>
+            <w:tcW w:type="dxa" w:w="4752"/>
+            <w:vAlign w:val="center"/>
+            <w:tcMar>
+              <w:top w:w="100" w:type="dxa"/>
+              <w:start w:w="120" w:type="dxa"/>
+              <w:bottom w:w="100" w:type="dxa"/>
+              <w:end w:w="120" w:type="dxa"/>
+            </w:tcMar>
+            <w:shd w:fill="F3F7FB"/>
+          </w:tcPr>
+          <w:p>
+            <w:pPr>
+              <w:spacing w:after="0"/>
+              <w:jc w:val="center"/>
+            </w:pPr>
+            <w:r>
+              <w:rPr>
+                <w:sz w:val="16"/>
+              </w:rPr>
+              <w:t>Prospective policy and human protocol frozen</w:t>
+            </w:r>
+          </w:p>
+        </w:tc>
+        <w:tc>
+          <w:tcPr>
+            <w:tcW w:type="dxa" w:w="3528"/>
+            <w:vAlign w:val="center"/>
+            <w:tcMar>
+              <w:top w:w="100" w:type="dxa"/>
+              <w:start w:w="120" w:type="dxa"/>
+              <w:bottom w:w="100" w:type="dxa"/>
+              <w:end w:w="120" w:type="dxa"/>
+            </w:tcMar>
+            <w:shd w:fill="F3F7FB"/>
+          </w:tcPr>
+          <w:p>
+            <w:pPr>
+              <w:spacing w:after="0"/>
+              <w:jc w:val="center"/>
+            </w:pPr>
+            <w:r>
+              <w:rPr>
+                <w:sz w:val="16"/>
+              </w:rPr>
+              <w:t>Validation grid, 64-position replay, node calibration, hidden schedule commitment, and blinded UCI proxy</w:t>
             </w:r>
           </w:p>
         </w:tc>
@@ -10454,7 +11628,7 @@
     </w:p>
     <w:p>
       <w:r>
-        <w:t>This version was assembled from the Git history through commit 2dbeaf0 plus the learned-selector milestone documented here, the repository roadmap and architecture notes, the Elo benchmark, the adaptive experiment contract, the profile and feature specifications, the reference-label stability study, the player-drift report, and the YashDutt7 model-results report. Personal raw games remain outside version control; frozen derived tree parameters are checked in with source hashes for reproducibility.</w:t>
+        <w:t>This version was assembled from the Git history through commit 2326f49 plus the prospective-experiment milestone documented here, the repository roadmap and architecture notes, the Elo benchmark, the adaptive experiment contract, the profile and feature specifications, the reference-label stability study, the player-drift report, and the YashDutt7 model-results report. Personal raw games and the private blinded schedule remain outside version control; frozen derived tree parameters and the schedule hash commitment are checked in for reproducibility.</w:t>
       </w:r>
     </w:p>
     <w:sectPr>

</xml_diff>